<commit_message>
scenario 4: complete master package with Lessons 0-5, 3 audio practices, interactives and 4 unique crisis bonuses
</commit_message>
<xml_diff>
--- a/baza/исходник миникурса/4 сценарий/Сценарий_4_Точка_опоры_ПОЛНЫЙ_КУРС.docx
+++ b/baza/исходник миникурса/4 сценарий/Сценарий_4_Точка_опоры_ПОЛНЫЙ_КУРС.docx
@@ -14,7 +14,7 @@
           <w:color w:val="1F4E5B"/>
           <w:sz w:val="36"/>
         </w:rPr>
-        <w:t>КУРС «ТОЧКА ОПОРЫ» (СЦЕНАРИЙ 4)</w:t>
+        <w:t>КУРС «ТОЧКА ОПОРЫ: КАК ПЕРЕЖИТЬ КРИЗИС И НЕ СЛОМАТЬСЯ»</w:t>
       </w:r>
     </w:p>
     <w:p>
@@ -29,7 +29,7 @@
           <w:color w:val="555555"/>
           <w:sz w:val="22"/>
         </w:rPr>
-        <w:t>Полный пошаговый мастер-документ: видео-суфлеры, аудиомедитации, антикризисные протоколы и бонусы</w:t>
+        <w:t>Полный генеральный пакет курса по Сценарию 4 (Уроки 0–5 + 4 уникальных бонуса + Аудиопрактики + Интерактивы)</w:t>
         <w:br/>
         <w:t>Автор: Федоров Анатолий Игоревич (Семейный психолог, гипнолог, проректор МАГиГ)</w:t>
       </w:r>
@@ -45,7 +45,7 @@
           <w:color w:val="1F4E5B"/>
           <w:sz w:val="26"/>
         </w:rPr>
-        <w:t>МЕТОДОЛОГИЧЕСКИЙ ПАСПОРТ СЦЕНАРИЯ 4</w:t>
+        <w:t>1. МЕТОДОЛОГИЧЕСКИЙ ПАСПОРТ СЦЕНАРИЯ 4</w:t>
       </w:r>
     </w:p>
     <w:p>
@@ -66,7 +66,7 @@
           <w:i w:val="0"/>
           <w:sz w:val="21"/>
         </w:rPr>
-        <w:t>Люди в острой фазе семейного кризиса: измена, угроза внезапного развода, ультиматум, предательство, ощущение крушения жизни.</w:t>
+        <w:t>Люди в острой фазе семейного кризиса (измена, угроза внезапного развода, ультиматум, предательство, ощущение крушения жизни). Возраст 32–52 года.</w:t>
       </w:r>
     </w:p>
     <w:p>
@@ -87,7 +87,7 @@
           <w:i w:val="0"/>
           <w:sz w:val="21"/>
         </w:rPr>
-        <w:t>Клиническая травматерапия измен Дженис Спринг (Janis Spring) + Поливагальная соматическая теория Стивена Порджеса (Polyvagal Theory) + Системная дифференциация Мюррея Боуэна (Bowen Theory).</w:t>
+        <w:t>Клинический протокол преодоления измен Дженис Спринг (Janis Spring) + Поливагальная соматическая регуляция Стивена Порджеса (Polyvagal Theory) + Системная дифференциация Мюррея Боуэна (Bowen Theory).</w:t>
       </w:r>
     </w:p>
     <w:p>
@@ -100,7 +100,7 @@
           <w:b/>
           <w:sz w:val="21"/>
         </w:rPr>
-        <w:t xml:space="preserve">Главная цель курса: </w:t>
+        <w:t xml:space="preserve">Главная цель: </w:t>
       </w:r>
       <w:r>
         <w:rPr>
@@ -108,7 +108,7 @@
           <w:i w:val="0"/>
           <w:sz w:val="21"/>
         </w:rPr>
-        <w:t>Снять панику и адреналиновый криз ➔ остановить разрушительные импульсивные действия на 14 дней ➔ вернуть контакт с телом и сон ➔ провести трезвый аудит ситуации ➔ принять взвешенное решение из силы и ясности, а не из страха.</w:t>
+        <w:t>Снять панику и физический спазм ➔ остановить разрушительные импульсивные действия на 14 дней ➔ защитить личные границы и детей ➔ провести трезвый аудит ситуации ➔ принять взвешенное решение из силы и достоинства, а не из страха.</w:t>
       </w:r>
     </w:p>
     <w:p>
@@ -121,7 +121,7 @@
           <w:b/>
           <w:sz w:val="21"/>
         </w:rPr>
-        <w:t xml:space="preserve">Ценовое предложение (Оффер): </w:t>
+        <w:t xml:space="preserve">Оффер: </w:t>
       </w:r>
       <w:r>
         <w:rPr>
@@ -130,146 +130,6 @@
           <w:sz w:val="21"/>
         </w:rPr>
         <w:t>2 400 ₽ при быстрой оплате в течение 1 часа (базовая цена — 5 000 ₽).</w:t>
-      </w:r>
-    </w:p>
-    <w:p>
-      <w:pPr>
-        <w:spacing w:before="280" w:after="80"/>
-      </w:pPr>
-      <w:r>
-        <w:rPr>
-          <w:rFonts w:ascii="Calibri" w:hAnsi="Calibri"/>
-          <w:b/>
-          <w:color w:val="1F4E5B"/>
-          <w:sz w:val="26"/>
-        </w:rPr>
-        <w:t>АРХИТЕКТУРА И ПЛАН КУРСА (УРОКИ 0–5)</w:t>
-      </w:r>
-    </w:p>
-    <w:p>
-      <w:pPr>
-        <w:spacing w:after="80" w:line="276" w:lineRule="auto"/>
-      </w:pPr>
-      <w:r>
-        <w:rPr>
-          <w:rFonts w:ascii="Calibri" w:hAnsi="Calibri"/>
-          <w:b/>
-          <w:sz w:val="21"/>
-        </w:rPr>
-        <w:t xml:space="preserve">Урок 0: Стоп-кран и экстренное заземление — </w:t>
-      </w:r>
-      <w:r>
-        <w:rPr>
-          <w:rFonts w:ascii="Calibri" w:hAnsi="Calibri"/>
-          <w:i w:val="0"/>
-          <w:sz w:val="21"/>
-        </w:rPr>
-        <w:t>Вводное видео + Экстренная аудиомедитация заземления (8 мин) + Оффер курса (2 400 ₽ вместо 5 000 ₽).</w:t>
-      </w:r>
-    </w:p>
-    <w:p>
-      <w:pPr>
-        <w:spacing w:after="80" w:line="276" w:lineRule="auto"/>
-      </w:pPr>
-      <w:r>
-        <w:rPr>
-          <w:rFonts w:ascii="Calibri" w:hAnsi="Calibri"/>
-          <w:b/>
-          <w:sz w:val="21"/>
-        </w:rPr>
-        <w:t xml:space="preserve">Урок 1: Физиология шока. Что происходит с вашим телом и мозгом — </w:t>
-      </w:r>
-      <w:r>
-        <w:rPr>
-          <w:rFonts w:ascii="Calibri" w:hAnsi="Calibri"/>
-          <w:i w:val="0"/>
-          <w:sz w:val="21"/>
-        </w:rPr>
-        <w:t>Почему земля ушла из-под ног, почему трясет тело и как за 10 минут снять адреналиновый спазм без таблеток.</w:t>
-      </w:r>
-    </w:p>
-    <w:p>
-      <w:pPr>
-        <w:spacing w:after="80" w:line="276" w:lineRule="auto"/>
-      </w:pPr>
-      <w:r>
-        <w:rPr>
-          <w:rFonts w:ascii="Calibri" w:hAnsi="Calibri"/>
-          <w:b/>
-          <w:sz w:val="21"/>
-        </w:rPr>
-        <w:t xml:space="preserve">Урок 2: Протокол тишины. Как не наломать дров в первые две недели — </w:t>
-      </w:r>
-      <w:r>
-        <w:rPr>
-          <w:rFonts w:ascii="Calibri" w:hAnsi="Calibri"/>
-          <w:i w:val="0"/>
-          <w:sz w:val="21"/>
-        </w:rPr>
-        <w:t>Правило 14 дней: о чем категорически молчать, запрет на слежку за телефоном, как отвечать на провокации без унижения.</w:t>
-      </w:r>
-    </w:p>
-    <w:p>
-      <w:pPr>
-        <w:spacing w:after="80" w:line="276" w:lineRule="auto"/>
-      </w:pPr>
-      <w:r>
-        <w:rPr>
-          <w:rFonts w:ascii="Calibri" w:hAnsi="Calibri"/>
-          <w:b/>
-          <w:sz w:val="21"/>
-        </w:rPr>
-        <w:t xml:space="preserve">Урок 3: Защита личных границ и разрушение треугольников — </w:t>
-      </w:r>
-      <w:r>
-        <w:rPr>
-          <w:rFonts w:ascii="Calibri" w:hAnsi="Calibri"/>
-          <w:i w:val="0"/>
-          <w:sz w:val="21"/>
-        </w:rPr>
-        <w:t>Как не втягивать детей, родителей и друзей, разорвать манипуляции третьей стороны и вернуть свое достоинство.</w:t>
-      </w:r>
-    </w:p>
-    <w:p>
-      <w:pPr>
-        <w:spacing w:after="80" w:line="276" w:lineRule="auto"/>
-      </w:pPr>
-      <w:r>
-        <w:rPr>
-          <w:rFonts w:ascii="Calibri" w:hAnsi="Calibri"/>
-          <w:b/>
-          <w:sz w:val="21"/>
-        </w:rPr>
-        <w:t xml:space="preserve">Урок 4: Трезвый аудит ситуации: без иллюзий и самобичевания — </w:t>
-      </w:r>
-      <w:r>
-        <w:rPr>
-          <w:rFonts w:ascii="Calibri" w:hAnsi="Calibri"/>
-          <w:i w:val="0"/>
-          <w:sz w:val="21"/>
-        </w:rPr>
-        <w:t>Разделение вины и ответственности: где реальный тупик, а где кризис роста. Практика «Холодный аудит отношений».</w:t>
-      </w:r>
-    </w:p>
-    <w:p>
-      <w:pPr>
-        <w:spacing w:after="80" w:line="276" w:lineRule="auto"/>
-      </w:pPr>
-      <w:r>
-        <w:rPr>
-          <w:rFonts w:ascii="Calibri" w:hAnsi="Calibri"/>
-          <w:b/>
-          <w:sz w:val="21"/>
-        </w:rPr>
-        <w:t xml:space="preserve">Урок 5: Точка выбора: спасать или отпускать — </w:t>
-      </w:r>
-      <w:r>
-        <w:rPr>
-          <w:rFonts w:ascii="Calibri" w:hAnsi="Calibri"/>
-          <w:i w:val="0"/>
-          <w:sz w:val="21"/>
-        </w:rPr>
-        <w:t>Критерии сохранения брака по новым жестким правилам ИЛИ цивилизованный красивый выход без разрушения себя и детей.</w:t>
       </w:r>
     </w:p>
     <w:p>
@@ -297,7 +157,7 @@
           <w:color w:val="0E6E5D"/>
           <w:sz w:val="23"/>
         </w:rPr>
-        <w:t>1. ТЕКСТ ДЛЯ СУФЛЁРА АНАТОЛИЯ ФЁДОРОВА (ВИДЕО 3 МИН)</w:t>
+        <w:t>1. ТЕКСТ СУФЛЁРА ДЛЯ ВИДЕО АНАТОЛИЯ ФЁДОРОВА (3 МИН)</w:t>
       </w:r>
     </w:p>
     <w:p>
@@ -316,20 +176,19 @@
         <w:t>Если вы сейчас смотрите это видео, значит, в вашей жизни произошел удар, к которому невозможно подготовиться заранее.</w:t>
         <w:br/>
         <w:br/>
-        <w:t>Измена. Внезапное признание. Разговор, после которого земля ушла из-под ног. Или кризис подошел к той черте, где звучит жесткое слово «развод».</w:t>
+        <w:t>Измена. Внезапное признание. Разговор, после которого земля ушла из-под ног. Или затяжной кризис подошел к черте, где звучит слово «развод».</w:t>
         <w:br/>
         <w:br/>
-        <w:t>Я сразу скажу вам честно, без сказок: я не обещаю, что за пару дней всё станет как раньше, а боль растворится по щелчку пальцев. То, через что вы сейчас проходите — это один из тяжелейших жизненных штормов.</w:t>
+        <w:t>Я сразу скажу вам честно: я не обещаю, что за пару дней всё волшебным образом вернется назад, а боль растворится сама собой. То, через что вы сейчас проходите — это тяжелейший жизненный шторм.</w:t>
         <w:br/>
         <w:br/>
         <w:t>Но я гарантирую другое: я помогу вам пройти этот шторм и не сломаться.</w:t>
         <w:br/>
         <w:br/>
-        <w:t>Прямо сейчас в вашей голове крутится миллион мыслей: «За что?», «Как он мог?», «Что я сделала не так?», «Что теперь будет с детьми?». Тело сковано, в груди ком, сон пропал. И главное, к чему тянет в этом состоянии — совершить резкое движение: устроить скандал, выставить чемоданы или, наоборот, умолять и унижаться.</w:t>
+        <w:t>Прямо сейчас в вашей голове крутятся сотни мыслей: «За что?», «Как он мог?», «Что теперь будет?». Тело сковано, в груди ком, сон пропал. И главное, к чему тянет в этом состоянии — совершить резкое движение: устроить скандал, выставить чемоданы или, наоборот, умолять на коленях.</w:t>
         <w:br/>
         <w:br/>
         <w:t>Прямо сейчас — нажмите стоп-кран.</w:t>
-        <w:br/>
         <w:br/>
         <w:t>Ни одно решение, принятое на пике эмоционального шторма, не бывает правильным. Вы рискуете совершить ошибки, о которых будете жалеть годами.</w:t>
         <w:br/>
@@ -376,7 +235,7 @@
         <w:t>С каждым выдохом отпускайте плечи вниз. Пусть они опустятся на сантиметр ниже. Разомкните зубы. Ослабьте челюсть.</w:t>
         <w:br/>
         <w:br/>
-        <w:t>То, что произошло — уже случилось. Но прямо в эту секунду, в этой комнате — вы в полной безопасности. Вам не нужно прямо сейчас никуда бежать. Вам не нужно прямо сейчас никому ничего доказывать. Вам не нужно принимать никаких решений прямо сейчас.</w:t>
+        <w:t>То, что произошло — уже случилось. Но прямо в эту секунду, в этой комнате — вы в полной безопасности. Вам не нужно прямо сейчас никуда бежать. Вам не нужно никому ничего доказывать. Вам не нужно принимать никаких решений сию секунду.</w:t>
         <w:br/>
         <w:br/>
         <w:t>Переведите все внимание в подошвы стоп. Почувствуйте плотность пола. Почувствуйте, как тяжелеют руки на коленях. С каждым выдохом ледяной ком в груди начинает медленно таять… отдавая напряжение вниз, в землю.</w:t>
@@ -400,7 +259,7 @@
           <w:color w:val="0E6E5D"/>
           <w:sz w:val="23"/>
         </w:rPr>
-        <w:t>3. ПРОДАЮЩИЙ БЛОК И СПЕЦИАЛЬНЫЙ ОФФЕР В NOTIBOT</w:t>
+        <w:t>3. ПРОДАЮЩИЙ БЛОК (ОФФЕР)</w:t>
       </w:r>
     </w:p>
     <w:p>
@@ -415,15 +274,668 @@
         </w:rPr>
         <w:t>⚡️ СПЕЦИАЛЬНОЕ ПРЕДЛОЖЕНИЕ ДЛЯ УЧАСТНИКОВ ТЕСТА:</w:t>
         <w:br/>
-        <w:t>Полный доступ к пошаговой антикризисной программе «Точка опоры» (5 уроков + 3 аудиопрактики + памятки + 4 бонуса):</w:t>
+        <w:t>• Полный курс «Точка опоры» (5 уроков + 3 аудиопрактики + памятки + 4 бонуса)</w:t>
         <w:br/>
         <w:t>• Обычная стоимость: 5 000 ₽</w:t>
         <w:br/>
-        <w:t>• Специальная цена сейчас: 2 400 ₽ (скидка более 50%)</w:t>
-        <w:br/>
-        <w:t>• Таймер фиксации спеццены: 60 минут</w:t>
+        <w:t>• Специальная цена сейчас: 2 400 ₽</w:t>
         <w:br/>
         <w:t>• Кнопка: [🧭 ПОЛУЧИТЬ ДОСТУП К КУРСУ ЗА 2 400 ₽]</w:t>
+      </w:r>
+    </w:p>
+    <w:p>
+      <w:pPr>
+        <w:spacing w:before="280" w:after="80"/>
+      </w:pPr>
+      <w:r>
+        <w:rPr>
+          <w:rFonts w:ascii="Calibri" w:hAnsi="Calibri"/>
+          <w:b/>
+          <w:color w:val="1F4E5B"/>
+          <w:sz w:val="26"/>
+        </w:rPr>
+        <w:t>УРОК 1: ПОЧЕМУ ВАС ТРЯСЕТ, НЕ ЛЕЗЕТ ЕДА И КАК ВЕРНУТЬ НОРМАЛЬНЫЙ СОН</w:t>
+      </w:r>
+    </w:p>
+    <w:p>
+      <w:pPr>
+        <w:spacing w:before="160" w:after="40"/>
+      </w:pPr>
+      <w:r>
+        <w:rPr>
+          <w:rFonts w:ascii="Calibri" w:hAnsi="Calibri"/>
+          <w:b/>
+          <w:color w:val="0E6E5D"/>
+          <w:sz w:val="23"/>
+        </w:rPr>
+        <w:t>1. ТЕКСТ СУФЛЁРА ДЛЯ ВИДЕО АНАТОЛИЯ ФЁДОРОВА (3.5 МИН)</w:t>
+      </w:r>
+    </w:p>
+    <w:p>
+      <w:pPr>
+        <w:spacing w:after="80" w:line="276" w:lineRule="auto"/>
+      </w:pPr>
+      <w:r>
+        <w:rPr>
+          <w:rFonts w:ascii="Calibri" w:hAnsi="Calibri"/>
+          <w:i/>
+          <w:sz w:val="21"/>
+        </w:rPr>
+        <w:t>«Здравствуйте. С вами Анатолий Фёдоров.</w:t>
+        <w:br/>
+        <w:br/>
+        <w:t>Первое, что происходит после измены или внезапной новости о разводе — это ощущение, что тело вам больше не принадлежит.</w:t>
+        <w:br/>
+        <w:br/>
+        <w:t>Вас может бить мелкая дрожь. В горле стоит такой ком, что невозможно проглотить даже глоток воды, а еда кажется безвкусной, как картон. Сердце колотится где-то в горле, а ночью вы просыпаетесь в три часа в холодном поту, и в голове по кругу крутится одна и та же шарманка: «Как он мог?», «С кем он сейчас?», «Что я сделала не так?».</w:t>
+        <w:br/>
+        <w:br/>
+        <w:t>И в этот момент многие пугаются еще сильнее и думают: «Всё, я схожу с ума. Я не выдержу этой боли».</w:t>
+        <w:br/>
+        <w:br/>
+        <w:t>Послушайте меня внимательно: с вами всё в порядке. Вы не сходите с ума.</w:t>
+        <w:br/>
+        <w:br/>
+        <w:t>То, что вы сейчас чувствуете — это абсолютно нормальная реакция живого организма на внезапный шок. Ваш мозг воспринял предательство точно так же, как физическое нападение. В кровь выплеснулась огромная доза адреналина и кортизола. Тело приготовилось к войне: желудок отключился (поэтому не лезет еда), мышцы шеи и челюсти спазмировались, а сон пропал, потому что мозг считает, что вы в смертельной опасности.</w:t>
+        <w:br/>
+        <w:br/>
+        <w:t>И пытаться сейчас «взять себя в руки» или «просто успокоиться» через силу — бесполезно. Гормоны стресса нельзя уговорить словами. Но их можно вывести через тело.</w:t>
+        <w:br/>
+        <w:br/>
+        <w:t>Прямо сейчас мы сделаем простое упражнение, которое перезагрузит вашу нервную систему за три минуты.</w:t>
+        <w:br/>
+        <w:br/>
+        <w:t>1. Сядьте ровно и положите одну ладонь на живот, чуть выше пупка.</w:t>
+        <w:br/>
+        <w:t>2. Сделайте спокойный вдох через нос на четыре счета: раз, два, три, четыре… надувая живот.</w:t>
+        <w:br/>
+        <w:t>3. А теперь сделайте длинный, медленный выдох через рот на шесть счетов: раз, два, три, четыре, пять, шесть… сдувая живот и роняя плечи вниз.</w:t>
+        <w:br/>
+        <w:t>4. И в самом конце выдоха сделайте короткую паузу на две секунды.</w:t>
+        <w:br/>
+        <w:br/>
+        <w:t>Когда вы делаете выдох длиннее вдоха, ваш мозг получает прямой сигнал: «Опасность миновала. Можно отпустить тормоза».</w:t>
+        <w:br/>
+        <w:br/>
+        <w:t>Делайте это дыхание прямо сейчас и повторяйте каждый раз, когда к горлу подкатывает паника. А под этим видео я прикрепил для вас памятку «Как быстро уснуть без снотворных в период стресса». Сделайте практику и нажимайте кнопку перехода к следующему шагу.»</w:t>
+      </w:r>
+    </w:p>
+    <w:p>
+      <w:pPr>
+        <w:spacing w:before="160" w:after="40"/>
+      </w:pPr>
+      <w:r>
+        <w:rPr>
+          <w:rFonts w:ascii="Calibri" w:hAnsi="Calibri"/>
+          <w:b/>
+          <w:color w:val="0E6E5D"/>
+          <w:sz w:val="23"/>
+        </w:rPr>
+        <w:t>2. ИНТЕРАКТИВ УРОКА 1</w:t>
+      </w:r>
+    </w:p>
+    <w:p>
+      <w:pPr>
+        <w:spacing w:after="80" w:line="276" w:lineRule="auto"/>
+      </w:pPr>
+      <w:r>
+        <w:rPr>
+          <w:rFonts w:ascii="Calibri" w:hAnsi="Calibri"/>
+          <w:i w:val="0"/>
+          <w:sz w:val="21"/>
+        </w:rPr>
+        <w:t>• Экранный таймер антистресс-дыхания: Вдох (4 сек) ➔ Выдох (6 сек) ➔ Пауза (2 сек).</w:t>
+        <w:br/>
+        <w:t>• Скачиваемый материал: Памятка «4 шага к глубокому сну без снотворных при остром стрессе».</w:t>
+        <w:br/>
+        <w:t>• Кнопка: [🧭 Дрожь отпустила • Перехожу к Уроку 2]</w:t>
+      </w:r>
+    </w:p>
+    <w:p>
+      <w:pPr>
+        <w:spacing w:before="280" w:after="80"/>
+      </w:pPr>
+      <w:r>
+        <w:rPr>
+          <w:rFonts w:ascii="Calibri" w:hAnsi="Calibri"/>
+          <w:b/>
+          <w:color w:val="1F4E5B"/>
+          <w:sz w:val="26"/>
+        </w:rPr>
+        <w:t>УРОК 2: ДВЕ НЕДЕЛИ ТИШИНЫ: О ЧЕМ НЕЛЬЗЯ ГОВОРИТЬ, ЧТОБЫ НЕ УНИЗИТЬСЯ И НЕ СДЕЛАТЬ ХУЖЕ</w:t>
+      </w:r>
+    </w:p>
+    <w:p>
+      <w:pPr>
+        <w:spacing w:before="160" w:after="40"/>
+      </w:pPr>
+      <w:r>
+        <w:rPr>
+          <w:rFonts w:ascii="Calibri" w:hAnsi="Calibri"/>
+          <w:b/>
+          <w:color w:val="0E6E5D"/>
+          <w:sz w:val="23"/>
+        </w:rPr>
+        <w:t>1. ТЕКСТ СУФЛЁРА ДЛЯ ВИДЕО АНАТОЛИЯ ФЁДОРОВА (4 МИН)</w:t>
+      </w:r>
+    </w:p>
+    <w:p>
+      <w:pPr>
+        <w:spacing w:after="80" w:line="276" w:lineRule="auto"/>
+      </w:pPr>
+      <w:r>
+        <w:rPr>
+          <w:rFonts w:ascii="Calibri" w:hAnsi="Calibri"/>
+          <w:i/>
+          <w:sz w:val="21"/>
+        </w:rPr>
+        <w:t>«Здравствуйте. С вами Анатолий Фёдоров.</w:t>
+        <w:br/>
+        <w:br/>
+        <w:t>Сегодня мы разберем самый опасный этап кризиса — первые две недели. Именно в эти 14 дней совершается 90% непоправимых ошибок, о которых потом мучительно жалеют годами.</w:t>
+        <w:br/>
+        <w:br/>
+        <w:t>Что тянет сделать человека в состоянии шока?</w:t>
+        <w:br/>
+        <w:t>Первое — начать ночные многочасовые допросы с пристрастием: «Расскажи в деталях, как это было! Где вы были? Что она тебе говорила? Ты ее любишь?». Вы надеетесь, что от этих ответов вам станет легче. Но правда в том, что каждая новая деталь вонзается в сердце как раскаленный нож и начинает крутиться в голове бесконечным фильмом ужасов.</w:t>
+        <w:br/>
+        <w:br/>
+        <w:t>Второе — тотальная слежка. Проверка телефона по ночам, геолокации, чтение переписок, мониторинг соцсетей соперницы. Это превращает вашу жизнь в персональный ад и полностью уничтожает остатки вашей самооценки.</w:t>
+        <w:br/>
+        <w:br/>
+        <w:t>И третье — унизительные мольбы: «Я всё прощу, я изменюсь, только не уходи!». Запомните: жалость никогда не вызывает уважения и любви. Она вызывает только раздражение и желание сбежать еще дальше.</w:t>
+        <w:br/>
+        <w:br/>
+        <w:t>Поэтому прямо сегодня мы вводим железное «Правило 14 дней».</w:t>
+        <w:br/>
+        <w:br/>
+        <w:t>1. Полный мораторий на обсуждение будущего брака на две недели. Никаких «давай поговорим, что нам делать дальше». Спокойный ответ: «Мне нужно время, чтобы прийти в себя и всё обдумать. Мы вернемся к этому разговору позже».</w:t>
+        <w:br/>
+        <w:t>2. Категорический запрет на слежку. Удалите закладки на чужие страницы. Не ищите детали — они не лечат, они травмируют.</w:t>
+        <w:br/>
+        <w:t>3. Сухой деловой контакт по быту и детям. Без слез, без упреков и без заискивания.</w:t>
+        <w:br/>
+        <w:br/>
+        <w:t>Это не игра в молчанку. Это создание защитного купола вокруг вашей психики, чтобы вы перестали сливать энергию и вернули себе контроль над ситуацией.</w:t>
+        <w:br/>
+        <w:br/>
+        <w:t>Под видео скачайте шпаргалку «3 фразы, которые останавливают провокации партнера и сохраняют ваше достоинство». Изучите их и переходите к Уроку 3.»</w:t>
+      </w:r>
+    </w:p>
+    <w:p>
+      <w:pPr>
+        <w:spacing w:before="160" w:after="40"/>
+      </w:pPr>
+      <w:r>
+        <w:rPr>
+          <w:rFonts w:ascii="Calibri" w:hAnsi="Calibri"/>
+          <w:b/>
+          <w:color w:val="0E6E5D"/>
+          <w:sz w:val="23"/>
+        </w:rPr>
+        <w:t>2. ИНТЕРАКТИВ УРОКА 2</w:t>
+      </w:r>
+    </w:p>
+    <w:p>
+      <w:pPr>
+        <w:spacing w:after="80" w:line="276" w:lineRule="auto"/>
+      </w:pPr>
+      <w:r>
+        <w:rPr>
+          <w:rFonts w:ascii="Calibri" w:hAnsi="Calibri"/>
+          <w:i w:val="0"/>
+          <w:sz w:val="21"/>
+        </w:rPr>
+        <w:t>• Интерактивный чек-лист: «Детектор роковых ошибок: проверяем свои действия» (3 вопроса: допросы, слежка, мольбы).</w:t>
+        <w:br/>
+        <w:t>• Скачиваемый материал: Шпаргалка «3 готовые формулировки для защиты своего достоинства в разговоре с партнером».</w:t>
+        <w:br/>
+        <w:t>• Кнопка: [🧭 Правило тишины принято • Перехожу к Уроку 3]</w:t>
+      </w:r>
+    </w:p>
+    <w:p>
+      <w:pPr>
+        <w:spacing w:before="280" w:after="80"/>
+      </w:pPr>
+      <w:r>
+        <w:rPr>
+          <w:rFonts w:ascii="Calibri" w:hAnsi="Calibri"/>
+          <w:b/>
+          <w:color w:val="1F4E5B"/>
+          <w:sz w:val="26"/>
+        </w:rPr>
+        <w:t>УРОК 3: ЗАЩИТА ЛИЧНЫХ ГРАНИЦ: КАК НЕ СТАТЬ ЖЕРТВОЙ МАНИПУЛЯЦИЙ И СПЛЕТЕН</w:t>
+      </w:r>
+    </w:p>
+    <w:p>
+      <w:pPr>
+        <w:spacing w:before="160" w:after="40"/>
+      </w:pPr>
+      <w:r>
+        <w:rPr>
+          <w:rFonts w:ascii="Calibri" w:hAnsi="Calibri"/>
+          <w:b/>
+          <w:color w:val="0E6E5D"/>
+          <w:sz w:val="23"/>
+        </w:rPr>
+        <w:t>1. ТЕКСТ СУФЛЁРА ДЛЯ ВИДЕО АНАТОЛИЯ ФЁДОРОВА (4 МИН)</w:t>
+      </w:r>
+    </w:p>
+    <w:p>
+      <w:pPr>
+        <w:spacing w:after="80" w:line="276" w:lineRule="auto"/>
+      </w:pPr>
+      <w:r>
+        <w:rPr>
+          <w:rFonts w:ascii="Calibri" w:hAnsi="Calibri"/>
+          <w:i/>
+          <w:sz w:val="21"/>
+        </w:rPr>
+        <w:t>«Здравствуйте. С вами Анатолий Фёдоров.</w:t>
+        <w:br/>
+        <w:br/>
+        <w:t>Когда в семье происходит шторм, вокруг него моментально возникает водоворот из других людей. И если не выставить жесткие границы, этот водоворот разорвет вас на куски.</w:t>
+        <w:br/>
+        <w:br/>
+        <w:t>Кто начинает лезть в вашу ситуацию?</w:t>
+        <w:br/>
+        <w:t>Первое — сердобольные родственники и подруги. Одни кричат: «Гони его в шею, все мужики козлы!», вторые шепчут: «Терпи ради детей, кому ты будешь нужна в сорок лет!». Запомните: все эти люди советуют из своих собственных страхов и травм. Жить с последствиями этих советов придется вам, а не им.</w:t>
+        <w:br/>
+        <w:br/>
+        <w:t>Второе — третья сторона (любовник или любовница). Часто партнер начинает сравнивать: «А вот она меня понимает, а ты вечно пилишь». Это классическая манипуляция, чтобы переложить вину за свой поступок на вас: «Ты сама виновата, что я пошел на сторону».</w:t>
+        <w:br/>
+        <w:br/>
+        <w:t>И самое уязвимое звено — это дети. Самая страшная ошибка — сделать ребенка своим союзником или жилеткой для слез: «Посмотри, как твой отец с нами поступил». Ребенок любит обоих родителей. Втягивая его в войну, вы наносите ему тяжелейшую психологическую травму на всю жизнь.</w:t>
+        <w:br/>
+        <w:br/>
+        <w:t>Как выстроить железобетонный забор вокруг своей территории?</w:t>
+        <w:br/>
+        <w:br/>
+        <w:t>1. Правило закрытой двери для советчиков: «Спасибо за заботу, но мы разберемся сами. Я не готова это обсуждать».</w:t>
+        <w:br/>
+        <w:t>2. Возврат вины автору поступка: Измена или уход — это личный выбор взрослого человека, а не ваша вина. Не берите на себя ответственность за чужие решения.</w:t>
+        <w:br/>
+        <w:t>3. Дети — вне зоны боевых действий: «Мы с папой сейчас переживаем сложный период как взрослые. Но мы оба тебя очень любим, и для тебя ничего не изменится».</w:t>
+        <w:br/>
+        <w:br/>
+        <w:t>Под видео вас ждет специальная 10-минутная аудиопрактика «Эмоциональный щит», которая поможет вам выстроить внутреннюю броню от чужих нападок и манипуляций. Прослушайте ее перед переходом к Уроку 4.»</w:t>
+      </w:r>
+    </w:p>
+    <w:p>
+      <w:pPr>
+        <w:spacing w:before="160" w:after="40"/>
+      </w:pPr>
+      <w:r>
+        <w:rPr>
+          <w:rFonts w:ascii="Calibri" w:hAnsi="Calibri"/>
+          <w:b/>
+          <w:color w:val="0E6E5D"/>
+          <w:sz w:val="23"/>
+        </w:rPr>
+        <w:t>2. АУДИОПРАКТИКА УРОКА 3</w:t>
+      </w:r>
+    </w:p>
+    <w:p>
+      <w:pPr>
+        <w:spacing w:after="80" w:line="276" w:lineRule="auto"/>
+      </w:pPr>
+      <w:r>
+        <w:rPr>
+          <w:rFonts w:ascii="Calibri" w:hAnsi="Calibri"/>
+          <w:i w:val="0"/>
+          <w:sz w:val="21"/>
+        </w:rPr>
+        <w:t>🎧 Аудиопрактика «Эмоциональный щит: как не принимать чужую вину на себя» (10 минут).</w:t>
+        <w:br/>
+        <w:t>Гипнотическая сессия Анатолия на отделение себя от манипуляций партнера и давления окружающих.</w:t>
+        <w:br/>
+        <w:t>• Кнопка: [🧭 Границы выставлены • Перехожу к Уроку 4]</w:t>
+      </w:r>
+    </w:p>
+    <w:p>
+      <w:pPr>
+        <w:spacing w:before="280" w:after="80"/>
+      </w:pPr>
+      <w:r>
+        <w:rPr>
+          <w:rFonts w:ascii="Calibri" w:hAnsi="Calibri"/>
+          <w:b/>
+          <w:color w:val="1F4E5B"/>
+          <w:sz w:val="26"/>
+        </w:rPr>
+        <w:t>УРОК 4: СМОТРИМ ПРАВДЕ В ГЛАЗА: ЕСТЬ ЛИ ШАНС ВСЁ ИСПРАВИТЬ ИЛИ ЭТО КОНЕЦ</w:t>
+      </w:r>
+    </w:p>
+    <w:p>
+      <w:pPr>
+        <w:spacing w:before="160" w:after="40"/>
+      </w:pPr>
+      <w:r>
+        <w:rPr>
+          <w:rFonts w:ascii="Calibri" w:hAnsi="Calibri"/>
+          <w:b/>
+          <w:color w:val="0E6E5D"/>
+          <w:sz w:val="23"/>
+        </w:rPr>
+        <w:t>1. ТЕКСТ СУФЛЁРА ДЛЯ ВИДЕО АНАТОЛИЯ ФЁДОРОВА (4.5 МИН)</w:t>
+      </w:r>
+    </w:p>
+    <w:p>
+      <w:pPr>
+        <w:spacing w:after="80" w:line="276" w:lineRule="auto"/>
+      </w:pPr>
+      <w:r>
+        <w:rPr>
+          <w:rFonts w:ascii="Calibri" w:hAnsi="Calibri"/>
+          <w:i/>
+          <w:sz w:val="21"/>
+        </w:rPr>
+        <w:t>«Здравствуйте. С вами Анатолий Фёдоров.</w:t>
+        <w:br/>
+        <w:br/>
+        <w:t>Когда первые эмоции улеглись, дрожь в теле прошла и границы выставлены — наступает время трезвого аудита. Без розовых очков и без самообмана.</w:t>
+        <w:br/>
+        <w:br/>
+        <w:t>Вам нужно понять реальное положение дел. Отношения можно спасти только тогда, когда есть ЧТО спасать и есть С КЕМ спасать.</w:t>
+        <w:br/>
+        <w:br/>
+        <w:t>Давайте разделим все ситуации на две категории.</w:t>
+        <w:br/>
+        <w:br/>
+        <w:t>Категория 1: «Кризис, в котором есть шанс». Это ситуация, когда:</w:t>
+        <w:br/>
+        <w:t>— Партнер искренне признает свою вину, не перекладывает ответственность на вас и прекратил всякий контакт на стороне;</w:t>
+        <w:br/>
+        <w:t>— Он готов отвечать на ваши вопросы, уважает ваши правила и готов восстанавливать доверие шаг за шагом;</w:t>
+        <w:br/>
+        <w:t>— Между вами, помимо боли, остается общее ценностное поле, уважение и обоюдное желание быть вместе.</w:t>
+        <w:br/>
+        <w:br/>
+        <w:t>Категория 2: «Тупик, где вас разрушают». Это ситуация, когда:</w:t>
+        <w:br/>
+        <w:t>— Партнер продолжает врать, держать вас на коротком поводке и жить на две семьи;</w:t>
+        <w:br/>
+        <w:t>— Он обесценивает вашу боль: «Ой, да подумаешь, ничего особенного, хватит психовать»;</w:t>
+        <w:br/>
+        <w:t>— Вас используют как удобную прислугу или кошелек, не давая взамен ни тепла, ни уважения.</w:t>
+        <w:br/>
+        <w:br/>
+        <w:t>Жить годами в надежде, что человек «вдруг одумается», пока об вас вытирают ноги — это медленное самоубийство.</w:t>
+        <w:br/>
+        <w:br/>
+        <w:t>Под этим видео я прикрепил интерактивный тренажер «Холодный аудит отношений». Ответьте честно на 5 ключевых вопросов. Это поможет вам увидеть факты, очищенные от страха и иллюзий. Выполните задание и переходите к финальному Уроку 5.»</w:t>
+      </w:r>
+    </w:p>
+    <w:p>
+      <w:pPr>
+        <w:spacing w:before="160" w:after="40"/>
+      </w:pPr>
+      <w:r>
+        <w:rPr>
+          <w:rFonts w:ascii="Calibri" w:hAnsi="Calibri"/>
+          <w:b/>
+          <w:color w:val="0E6E5D"/>
+          <w:sz w:val="23"/>
+        </w:rPr>
+        <w:t>2. ИНТЕРАКТИВ УРОКА 4</w:t>
+      </w:r>
+    </w:p>
+    <w:p>
+      <w:pPr>
+        <w:spacing w:after="80" w:line="276" w:lineRule="auto"/>
+      </w:pPr>
+      <w:r>
+        <w:rPr>
+          <w:rFonts w:ascii="Calibri" w:hAnsi="Calibri"/>
+          <w:i w:val="0"/>
+          <w:sz w:val="21"/>
+        </w:rPr>
+        <w:t>• Интерактивный опросник «Аудит реальности: Факты против Иллюзий» (5 тестовых ситуаций с автоматическим определением шанса на восстановление союза).</w:t>
+        <w:br/>
+        <w:t>• Кнопка: [🧭 Картина ясна • Перехожу к финальному Уроку 5]</w:t>
+      </w:r>
+    </w:p>
+    <w:p>
+      <w:pPr>
+        <w:spacing w:before="280" w:after="80"/>
+      </w:pPr>
+      <w:r>
+        <w:rPr>
+          <w:rFonts w:ascii="Calibri" w:hAnsi="Calibri"/>
+          <w:b/>
+          <w:color w:val="1F4E5B"/>
+          <w:sz w:val="26"/>
+        </w:rPr>
+        <w:t>УРОК 5: СПАСАТЬ СЕМЬЮ ПО НОВЫМ ПРАВИЛАМ ИЛИ СПОКОЙНО УЙТИ С ВЫСОКО ПОДНЯТОЙ ГОЛОВОЙ</w:t>
+      </w:r>
+    </w:p>
+    <w:p>
+      <w:pPr>
+        <w:spacing w:before="160" w:after="40"/>
+      </w:pPr>
+      <w:r>
+        <w:rPr>
+          <w:rFonts w:ascii="Calibri" w:hAnsi="Calibri"/>
+          <w:b/>
+          <w:color w:val="0E6E5D"/>
+          <w:sz w:val="23"/>
+        </w:rPr>
+        <w:t>1. ТЕКСТ СУФЛЁРА ДЛЯ ВИДЕО АНАТОЛИЯ ФЁДОРОВА (4.5 МИН)</w:t>
+      </w:r>
+    </w:p>
+    <w:p>
+      <w:pPr>
+        <w:spacing w:after="80" w:line="276" w:lineRule="auto"/>
+      </w:pPr>
+      <w:r>
+        <w:rPr>
+          <w:rFonts w:ascii="Calibri" w:hAnsi="Calibri"/>
+          <w:i/>
+          <w:sz w:val="21"/>
+        </w:rPr>
+        <w:t>«Здравствуйте. С вами Анатолий Фёдоров. Мы подошли к главному шагу нашего пути — к точке вашего осознанного выбора.</w:t>
+        <w:br/>
+        <w:br/>
+        <w:t>За эти дни вы проделали огромную работу: остановили панику, защитили себя от глупостей, выставили границы и посмотрели правде в глаза. Теперь перед вами развилка из двух дорог. И какую бы дорогу вы ни выбрали — вы выберете ее из состояния силы и достоинства, а не из беспомощности.</w:t>
+        <w:br/>
+        <w:br/>
+        <w:t>ПУТЬ 1: Если вы оба решаете сохранить брак.</w:t>
+        <w:br/>
+        <w:t>Запомните главное правило: «Как раньше» уже никогда не будет. Прежний брак умер в момент предательства. Но на его месте можно построить новый, взрослый союз.</w:t>
+        <w:br/>
+        <w:t>Для этого нужны 3 жестких условия:</w:t>
+        <w:br/>
+        <w:t>1. Полная прозрачность и оборванные контакты с прошлым.</w:t>
+        <w:br/>
+        <w:t>2. Мораторий на бесконечные упреки: если простили — не превращайте измену в вечное оружие для шантажа.</w:t>
+        <w:br/>
+        <w:t>3. Заключение «Нового семейного пакта» с четкими правилами уважения и личных границ.</w:t>
+        <w:br/>
+        <w:br/>
+        <w:t>ПУТЬ 2: Если вы решаете расстаться.</w:t>
+        <w:br/>
+        <w:t>Развод — это не конец жизни. Это окончание тяжелого и деструктивного этапа. Вы выходите из этих отношений не жертвой, а человеком, который выбрал себя, свое здоровье и будущее своих детей.</w:t>
+        <w:br/>
+        <w:t>Главные правила цивилизованного выхода:</w:t>
+        <w:br/>
+        <w:t>1. Холодный деловой подход: имущество и алименты решаются через документы и юристов, а не через ночные истерики.</w:t>
+        <w:br/>
+        <w:t>2. Сохранение родительской позиции: вы перестаете быть мужем и женой, но остаетесь родителями.</w:t>
+        <w:br/>
+        <w:t>3. Возврат своей жизни: фокус на своем теле, карьере, увлечениях и создании нового счастливого круга общения.</w:t>
+        <w:br/>
+        <w:br/>
+        <w:t>Вы справились со штормом. Вы выстояли. И теперь опора внутри вас никуда не денется.</w:t>
+        <w:br/>
+        <w:br/>
+        <w:t>Под этим видео вас ждет главная восстанавливающая аудиопрактика курса «Моя нерушимая опора» и пакет из 4 специальных бонусов. Я желаю вам спокойствия, ясности и твердости духа. До встречи!»</w:t>
+      </w:r>
+    </w:p>
+    <w:p>
+      <w:pPr>
+        <w:spacing w:before="160" w:after="40"/>
+      </w:pPr>
+      <w:r>
+        <w:rPr>
+          <w:rFonts w:ascii="Calibri" w:hAnsi="Calibri"/>
+          <w:b/>
+          <w:color w:val="0E6E5D"/>
+          <w:sz w:val="23"/>
+        </w:rPr>
+        <w:t>2. ГЛАВНАЯ АУДИОПРАКТИКА УРОКА 5</w:t>
+      </w:r>
+    </w:p>
+    <w:p>
+      <w:pPr>
+        <w:spacing w:after="80" w:line="276" w:lineRule="auto"/>
+      </w:pPr>
+      <w:r>
+        <w:rPr>
+          <w:rFonts w:ascii="Calibri" w:hAnsi="Calibri"/>
+          <w:i w:val="0"/>
+          <w:sz w:val="21"/>
+        </w:rPr>
+        <w:t>🎧 Аудиопрактика «Моя нерушимая опора: возвращение силы и достоинства» (12 минут).</w:t>
+        <w:br/>
+        <w:t>Глубокая гипнотическая сессия на закрепление автономии, спокойной уверенности и веры в счастливое будущее.</w:t>
+      </w:r>
+    </w:p>
+    <w:p>
+      <w:pPr>
+        <w:spacing w:before="280" w:after="80"/>
+      </w:pPr>
+      <w:r>
+        <w:rPr>
+          <w:rFonts w:ascii="Calibri" w:hAnsi="Calibri"/>
+          <w:b/>
+          <w:color w:val="1F4E5B"/>
+          <w:sz w:val="26"/>
+        </w:rPr>
+        <w:t>ПАКЕТ 4-Х УНИКАЛЬНЫХ БОНУСОВ КУРСА (БЕЗ ДУБЛИРОВАНИЯ)</w:t>
+      </w:r>
+    </w:p>
+    <w:p>
+      <w:pPr>
+        <w:spacing w:before="160" w:after="40"/>
+      </w:pPr>
+      <w:r>
+        <w:rPr>
+          <w:rFonts w:ascii="Calibri" w:hAnsi="Calibri"/>
+          <w:b/>
+          <w:color w:val="0E6E5D"/>
+          <w:sz w:val="23"/>
+        </w:rPr>
+        <w:t>БОНУС 1: «Антипаника: как сказать детям о разводе или паузе без детских травм»</w:t>
+      </w:r>
+    </w:p>
+    <w:p>
+      <w:pPr>
+        <w:spacing w:after="80" w:line="276" w:lineRule="auto"/>
+      </w:pPr>
+      <w:r>
+        <w:rPr>
+          <w:rFonts w:ascii="Calibri" w:hAnsi="Calibri"/>
+          <w:i w:val="0"/>
+          <w:sz w:val="21"/>
+        </w:rPr>
+        <w:t>• Точные возрастные скрипты разговора с детьми (3–6 лет, 7–12 лет, подростки 13–17 лет).</w:t>
+        <w:br/>
+        <w:t>• 5 категорических запретов: чего никогда нельзя говорить ребенку о втором родителе.</w:t>
+        <w:br/>
+        <w:t>• Как реагировать на детские слезы, агрессию и вопросы: «Вы помиритесь?» без вранья и чувства вины.</w:t>
+      </w:r>
+    </w:p>
+    <w:p>
+      <w:pPr>
+        <w:spacing w:before="160" w:after="40"/>
+      </w:pPr>
+      <w:r>
+        <w:rPr>
+          <w:rFonts w:ascii="Calibri" w:hAnsi="Calibri"/>
+          <w:b/>
+          <w:color w:val="0E6E5D"/>
+          <w:sz w:val="23"/>
+        </w:rPr>
+        <w:t>БОНУС 2: «Новый семейный пакт: 5 жестких правил восстановления доверия после измены»</w:t>
+      </w:r>
+    </w:p>
+    <w:p>
+      <w:pPr>
+        <w:spacing w:after="80" w:line="276" w:lineRule="auto"/>
+      </w:pPr>
+      <w:r>
+        <w:rPr>
+          <w:rFonts w:ascii="Calibri" w:hAnsi="Calibri"/>
+          <w:i w:val="0"/>
+          <w:sz w:val="21"/>
+        </w:rPr>
+        <w:t>• Протокол прозрачности для партнера (гаджеты, задержки на работе, поездки) без унизительного тотального контроля.</w:t>
+        <w:br/>
+        <w:t>• Правило постепенного сближения: как вернуть физический контакт и объятия, когда обида еще не ушла.</w:t>
+        <w:br/>
+        <w:t>• Юридический и эмоциональный договор пары на 6 месяцев испытательного срока.</w:t>
+      </w:r>
+    </w:p>
+    <w:p>
+      <w:pPr>
+        <w:spacing w:before="160" w:after="40"/>
+      </w:pPr>
+      <w:r>
+        <w:rPr>
+          <w:rFonts w:ascii="Calibri" w:hAnsi="Calibri"/>
+          <w:b/>
+          <w:color w:val="0E6E5D"/>
+          <w:sz w:val="23"/>
+        </w:rPr>
+        <w:t>БОНУС 3: «Юридическая и финансовая безопасность: как защитить активы, жилье и алименты»</w:t>
+      </w:r>
+    </w:p>
+    <w:p>
+      <w:pPr>
+        <w:spacing w:after="80" w:line="276" w:lineRule="auto"/>
+      </w:pPr>
+      <w:r>
+        <w:rPr>
+          <w:rFonts w:ascii="Calibri" w:hAnsi="Calibri"/>
+          <w:i w:val="0"/>
+          <w:sz w:val="21"/>
+        </w:rPr>
+        <w:t>• Пошаговый чек-лист подготовки к разводу без паники: сбор документов, выписки со счетов, фиксация имущества.</w:t>
+        <w:br/>
+        <w:t>• Как цивилизованно договориться об алиментах и порядке общения с детьми через нотариальное соглашение, избегая судов и грязных споров.</w:t>
+        <w:br/>
+        <w:t>• 3 финансовые ошибки, из-за которых женщины и мужчины теряют имущество при разводе.</w:t>
+      </w:r>
+    </w:p>
+    <w:p>
+      <w:pPr>
+        <w:spacing w:before="160" w:after="40"/>
+      </w:pPr>
+      <w:r>
+        <w:rPr>
+          <w:rFonts w:ascii="Calibri" w:hAnsi="Calibri"/>
+          <w:b/>
+          <w:color w:val="0E6E5D"/>
+          <w:sz w:val="23"/>
+        </w:rPr>
+        <w:t>БОНУС 4: «Выход из любовного треугольника: как перестать быть третьим лишним или терпеть двойную жизнь»</w:t>
+      </w:r>
+    </w:p>
+    <w:p>
+      <w:pPr>
+        <w:spacing w:after="80" w:line="276" w:lineRule="auto"/>
+      </w:pPr>
+      <w:r>
+        <w:rPr>
+          <w:rFonts w:ascii="Calibri" w:hAnsi="Calibri"/>
+          <w:i w:val="0"/>
+          <w:sz w:val="21"/>
+        </w:rPr>
+        <w:t>• Психология «двойной жизни»: почему партнер годами сидит на двух стульях и кормит завтраками.</w:t>
+        <w:br/>
+        <w:t>• Техника жесткого ультиматума с установлением дедлайна: как поставить вопрос ребром и не сорваться.</w:t>
+        <w:br/>
+        <w:t>• Как пережить синдром отмены и ломку при разрыве токсичной любовной связи.</w:t>
       </w:r>
     </w:p>
     <w:sectPr>

</xml_diff>

<commit_message>
scenario 4: calibrate gender balance (men & women 32-52) and enforce 100% realistic achievable promises
</commit_message>
<xml_diff>
--- a/baza/исходник миникурса/4 сценарий/Сценарий_4_Точка_опоры_ПОЛНЫЙ_КУРС.docx
+++ b/baza/исходник миникурса/4 сценарий/Сценарий_4_Точка_опоры_ПОЛНЫЙ_КУРС.docx
@@ -12,7 +12,7 @@
           <w:rFonts w:ascii="Calibri" w:hAnsi="Calibri"/>
           <w:b/>
           <w:color w:val="1F4E5B"/>
-          <w:sz w:val="36"/>
+          <w:sz w:val="34"/>
         </w:rPr>
         <w:t>КУРС «ТОЧКА ОПОРЫ: КАК ПЕРЕЖИТЬ КРИЗИС И НЕ СЛОМАТЬСЯ»</w:t>
       </w:r>
@@ -27,23 +27,23 @@
           <w:rFonts w:ascii="Calibri" w:hAnsi="Calibri"/>
           <w:i/>
           <w:color w:val="555555"/>
-          <w:sz w:val="22"/>
+          <w:sz w:val="21"/>
         </w:rPr>
-        <w:t>Полный генеральный пакет курса по Сценарию 4 (Уроки 0–5 + 4 уникальных бонуса + Аудиопрактики + Интерактивы)</w:t>
+        <w:t>Генеральный мастер-пакет: видео-суфлеры, аудиопрактики, интерактивы и бонусы (Гендерно-сбалансированная редакция для мужчин и женщин)</w:t>
         <w:br/>
         <w:t>Автор: Федоров Анатолий Игоревич (Семейный психолог, гипнолог, проректор МАГиГ)</w:t>
       </w:r>
     </w:p>
     <w:p>
       <w:pPr>
-        <w:spacing w:before="280" w:after="80"/>
+        <w:spacing w:before="240" w:after="60"/>
       </w:pPr>
       <w:r>
         <w:rPr>
           <w:rFonts w:ascii="Calibri" w:hAnsi="Calibri"/>
           <w:b/>
           <w:color w:val="1F4E5B"/>
-          <w:sz w:val="26"/>
+          <w:sz w:val="25"/>
         </w:rPr>
         <w:t>1. МЕТОДОЛОГИЧЕСКИЙ ПАСПОРТ СЦЕНАРИЯ 4</w:t>
       </w:r>
@@ -56,7 +56,7 @@
         <w:rPr>
           <w:rFonts w:ascii="Calibri" w:hAnsi="Calibri"/>
           <w:b/>
-          <w:sz w:val="21"/>
+          <w:sz w:val="20"/>
         </w:rPr>
         <w:t xml:space="preserve">Целевая аудитория: </w:t>
       </w:r>
@@ -64,9 +64,9 @@
         <w:rPr>
           <w:rFonts w:ascii="Calibri" w:hAnsi="Calibri"/>
           <w:i w:val="0"/>
-          <w:sz w:val="21"/>
+          <w:sz w:val="20"/>
         </w:rPr>
-        <w:t>Люди в острой фазе семейного кризиса (измена, угроза внезапного развода, ультиматум, предательство, ощущение крушения жизни). Возраст 32–52 года.</w:t>
+        <w:t>Мужчины и женщины (32–52 года), переживающие острый семейный кризис: измена партнера, внезапное заявление о разводе, ультиматум, предательство, ощущение крушения привычной жизни.</w:t>
       </w:r>
     </w:p>
     <w:p>
@@ -77,7 +77,7 @@
         <w:rPr>
           <w:rFonts w:ascii="Calibri" w:hAnsi="Calibri"/>
           <w:b/>
-          <w:sz w:val="21"/>
+          <w:sz w:val="20"/>
         </w:rPr>
         <w:t xml:space="preserve">Психотерапевтическая база: </w:t>
       </w:r>
@@ -85,9 +85,9 @@
         <w:rPr>
           <w:rFonts w:ascii="Calibri" w:hAnsi="Calibri"/>
           <w:i w:val="0"/>
-          <w:sz w:val="21"/>
+          <w:sz w:val="20"/>
         </w:rPr>
-        <w:t>Клинический протокол преодоления измен Дженис Спринг (Janis Spring) + Поливагальная соматическая регуляция Стивена Порджеса (Polyvagal Theory) + Системная дифференциация Мюррея Боуэна (Bowen Theory).</w:t>
+        <w:t>Клинический протокол Дженис Спринг (Janis Spring) + Поливагальная соматическая теория Стивена Порджеса (Polyvagal Theory) + Системная дифференциация Мюррея Боуэна (Bowen Theory).</w:t>
       </w:r>
     </w:p>
     <w:p>
@@ -98,17 +98,17 @@
         <w:rPr>
           <w:rFonts w:ascii="Calibri" w:hAnsi="Calibri"/>
           <w:b/>
-          <w:sz w:val="21"/>
+          <w:sz w:val="20"/>
         </w:rPr>
-        <w:t xml:space="preserve">Главная цель: </w:t>
+        <w:t xml:space="preserve">Реальная цель без завышенных ожиданий: </w:t>
       </w:r>
       <w:r>
         <w:rPr>
           <w:rFonts w:ascii="Calibri" w:hAnsi="Calibri"/>
           <w:i w:val="0"/>
-          <w:sz w:val="21"/>
+          <w:sz w:val="20"/>
         </w:rPr>
-        <w:t>Снять панику и физический спазм ➔ остановить разрушительные импульсивные действия на 14 дней ➔ защитить личные границы и детей ➔ провести трезвый аудит ситуации ➔ принять взвешенное решение из силы и достоинства, а не из страха.</w:t>
+        <w:t>Снять адреналиновый шок и дрожь в теле ➔ остановить импульсивные ошибки на 14 дней (запрет на слежку, скандалы и унижения) ➔ защитить детей и границы ➔ провести трезвый аудит ➔ принять взвешенное решение из силы и ясности.</w:t>
       </w:r>
     </w:p>
     <w:p>
@@ -119,7 +119,7 @@
         <w:rPr>
           <w:rFonts w:ascii="Calibri" w:hAnsi="Calibri"/>
           <w:b/>
-          <w:sz w:val="21"/>
+          <w:sz w:val="20"/>
         </w:rPr>
         <w:t xml:space="preserve">Оффер: </w:t>
       </w:r>
@@ -127,21 +127,21 @@
         <w:rPr>
           <w:rFonts w:ascii="Calibri" w:hAnsi="Calibri"/>
           <w:i w:val="0"/>
-          <w:sz w:val="21"/>
+          <w:sz w:val="20"/>
         </w:rPr>
         <w:t>2 400 ₽ при быстрой оплате в течение 1 часа (базовая цена — 5 000 ₽).</w:t>
       </w:r>
     </w:p>
     <w:p>
       <w:pPr>
-        <w:spacing w:before="280" w:after="80"/>
+        <w:spacing w:before="240" w:after="60"/>
       </w:pPr>
       <w:r>
         <w:rPr>
           <w:rFonts w:ascii="Calibri" w:hAnsi="Calibri"/>
           <w:b/>
           <w:color w:val="1F4E5B"/>
-          <w:sz w:val="26"/>
+          <w:sz w:val="25"/>
         </w:rPr>
         <w:t>УРОК 0: СТОП-КРАН И ЭКСТРЕННОЕ ЗАЗЕМЛЕНИЕ</w:t>
       </w:r>
@@ -155,7 +155,7 @@
           <w:rFonts w:ascii="Calibri" w:hAnsi="Calibri"/>
           <w:b/>
           <w:color w:val="0E6E5D"/>
-          <w:sz w:val="23"/>
+          <w:sz w:val="22"/>
         </w:rPr>
         <w:t>1. ТЕКСТ СУФЛЁРА ДЛЯ ВИДЕО АНАТОЛИЯ ФЁДОРОВА (3 МИН)</w:t>
       </w:r>
@@ -168,7 +168,7 @@
         <w:rPr>
           <w:rFonts w:ascii="Calibri" w:hAnsi="Calibri"/>
           <w:i/>
-          <w:sz w:val="21"/>
+          <w:sz w:val="20"/>
         </w:rPr>
         <w:t>«Здравствуйте. С вами Анатолий Фёдоров.</w:t>
         <w:br/>
@@ -176,24 +176,24 @@
         <w:t>Если вы сейчас смотрите это видео, значит, в вашей жизни произошел удар, к которому невозможно подготовиться заранее.</w:t>
         <w:br/>
         <w:br/>
-        <w:t>Измена. Внезапное признание. Разговор, после которого земля ушла из-под ног. Или затяжной кризис подошел к черте, где звучит слово «развод».</w:t>
+        <w:t>Измена. Внезапное признание. Разговор, после которого земля ушла из-под ног. Или затяжной кризис подошел к той черте, где прозвучало жесткое: «Я так больше не могу, давай разводиться».</w:t>
         <w:br/>
         <w:br/>
-        <w:t>Я сразу скажу вам честно: я не обещаю, что за пару дней всё волшебным образом вернется назад, а боль растворится сама собой. То, через что вы сейчас проходите — это тяжелейший жизненный шторм.</w:t>
+        <w:t>Я сразу скажу вам честно, без красивых сказок: я не обещаю, что за пару дней всё волшебным образом станет как раньше, а душевная боль исчезнет по щелчку пальцев. То, через что вы сейчас проходите — это один из самых тяжелых жизненных штормов.</w:t>
         <w:br/>
         <w:br/>
         <w:t>Но я гарантирую другое: я помогу вам пройти этот шторм и не сломаться.</w:t>
         <w:br/>
         <w:br/>
-        <w:t>Прямо сейчас в вашей голове крутятся сотни мыслей: «За что?», «Как он мог?», «Что теперь будет?». Тело сковано, в груди ком, сон пропал. И главное, к чему тянет в этом состоянии — совершить резкое движение: устроить скандал, выставить чемоданы или, наоборот, умолять на коленях.</w:t>
+        <w:t>Прямо сейчас внутри — либо ледяная пустота, либо дикая паника. В голове крутятся сотни мыслей: «За что?», «Как близкий человек мог так поступить?», «Что теперь будет с детьми, с домом, с будущим?». Тело сковано, в груди ком, сон нарушен. И главное, к чему тянет в этом состоянии — совершить резкое движение: устроить скандал, выставить вещи, сжечь мосты или, наоборот, умолять и унижаться.</w:t>
         <w:br/>
         <w:br/>
         <w:t>Прямо сейчас — нажмите стоп-кран.</w:t>
         <w:br/>
-        <w:t>Ни одно решение, принятое на пике эмоционального шторма, не бывает правильным. Вы рискуете совершить ошибки, о которых будете жалеть годами.</w:t>
+        <w:t>Ни одно решение, принятое на пике эмоционального шторма, не бывает правильным. В таком состоянии легко совершить фатальные ошибки, о которых потом жалеют годами.</w:t>
         <w:br/>
         <w:br/>
-        <w:t>Наш курс «Точка опоры» — это пошаговая инструкция на ближайшие 14 дней. Мы не будем прямо сейчас решать судьбу семьи. Сначала мы вернем вам сон, нормальное дыхание, снимем дрожь в теле и защитим от непоправимых поступков.</w:t>
+        <w:t>Наш курс «Точка опоры» — это пошаговая инструкция на ближайшие 14 дней. Мы не будем прямо сейчас решать судьбу вашей семьи. Сначала мы вернем вам сон, нормальное дыхание, снимем дрожь в теле и защитим от непоправимых поступков.</w:t>
         <w:br/>
         <w:br/>
         <w:t>И начнем мы прямо сейчас — с вашего тела.</w:t>
@@ -211,7 +211,7 @@
           <w:rFonts w:ascii="Calibri" w:hAnsi="Calibri"/>
           <w:b/>
           <w:color w:val="0E6E5D"/>
-          <w:sz w:val="23"/>
+          <w:sz w:val="22"/>
         </w:rPr>
         <w:t>2. ЭКСТРЕННАЯ АУДИОМЕДИТАЦИЯ «ВОЗВРАЩАЕМ ПОЧВУ ПОД НОГАМИ» (8 МИН)</w:t>
       </w:r>
@@ -224,7 +224,7 @@
         <w:rPr>
           <w:rFonts w:ascii="Calibri" w:hAnsi="Calibri"/>
           <w:i/>
-          <w:sz w:val="21"/>
+          <w:sz w:val="20"/>
         </w:rPr>
         <w:t>«Сядьте так, чтобы ваша спина чувствовала надежную опору кресла или стены. Поставьте обе стопы на пол. Почувствуйте, как твердый, устойчивый пол держит ваш вес. Земля никуда не ушла. Пол под ногами абсолютно неподвижен.</w:t>
         <w:br/>
@@ -235,7 +235,7 @@
         <w:t>С каждым выдохом отпускайте плечи вниз. Пусть они опустятся на сантиметр ниже. Разомкните зубы. Ослабьте челюсть.</w:t>
         <w:br/>
         <w:br/>
-        <w:t>То, что произошло — уже случилось. Но прямо в эту секунду, в этой комнате — вы в полной безопасности. Вам не нужно прямо сейчас никуда бежать. Вам не нужно никому ничего доказывать. Вам не нужно принимать никаких решений сию секунду.</w:t>
+        <w:t>То, что произошло — уже случилось. Но прямо в эту секунду, в этой комнате — вы в полной безопасности. Вам не нужно прямо сейчас никуда бежать. Вам не нужно никому ничего доказывать. Вам не нужно принимать никаких судьбоносных решений сию секунду.</w:t>
         <w:br/>
         <w:br/>
         <w:t>Переведите все внимание в подошвы стоп. Почувствуйте плотность пола. Почувствуйте, как тяжелеют руки на коленях. С каждым выдохом ледяной ком в груди начинает медленно таять… отдавая напряжение вниз, в землю.</w:t>
@@ -243,7 +243,7 @@
         <w:br/>
         <w:t>Вы дышите. Ваше тело живо. Вы справитесь с этим днем. А затем со следующим.</w:t>
         <w:br/>
-        <w:t>Вдох — спокойствие и устойчивость… Выдох — суета и страх уходят прочь.</w:t>
+        <w:t>Вдох — спокойствие и устойчивость… Выдох — суета и паника уходят прочь.</w:t>
         <w:br/>
         <w:t>Сохраните это ощущение твердой опоры под ногами. Потянитесь, откройте глаза и возвращайтесь к экрану.»</w:t>
       </w:r>
@@ -257,9 +257,9 @@
           <w:rFonts w:ascii="Calibri" w:hAnsi="Calibri"/>
           <w:b/>
           <w:color w:val="0E6E5D"/>
-          <w:sz w:val="23"/>
+          <w:sz w:val="22"/>
         </w:rPr>
-        <w:t>3. ПРОДАЮЩИЙ БЛОК (ОФФЕР)</w:t>
+        <w:t>3. ПРОДАЮЩИЙ БЛОК В NOTIBOT</w:t>
       </w:r>
     </w:p>
     <w:p>
@@ -270,7 +270,7 @@
         <w:rPr>
           <w:rFonts w:ascii="Calibri" w:hAnsi="Calibri"/>
           <w:i w:val="0"/>
-          <w:sz w:val="21"/>
+          <w:sz w:val="20"/>
         </w:rPr>
         <w:t>⚡️ СПЕЦИАЛЬНОЕ ПРЕДЛОЖЕНИЕ ДЛЯ УЧАСТНИКОВ ТЕСТА:</w:t>
         <w:br/>
@@ -285,14 +285,14 @@
     </w:p>
     <w:p>
       <w:pPr>
-        <w:spacing w:before="280" w:after="80"/>
+        <w:spacing w:before="240" w:after="60"/>
       </w:pPr>
       <w:r>
         <w:rPr>
           <w:rFonts w:ascii="Calibri" w:hAnsi="Calibri"/>
           <w:b/>
           <w:color w:val="1F4E5B"/>
-          <w:sz w:val="26"/>
+          <w:sz w:val="25"/>
         </w:rPr>
         <w:t>УРОК 1: ПОЧЕМУ ВАС ТРЯСЕТ, НЕ ЛЕЗЕТ ЕДА И КАК ВЕРНУТЬ НОРМАЛЬНЫЙ СОН</w:t>
       </w:r>
@@ -306,7 +306,7 @@
           <w:rFonts w:ascii="Calibri" w:hAnsi="Calibri"/>
           <w:b/>
           <w:color w:val="0E6E5D"/>
-          <w:sz w:val="23"/>
+          <w:sz w:val="22"/>
         </w:rPr>
         <w:t>1. ТЕКСТ СУФЛЁРА ДЛЯ ВИДЕО АНАТОЛИЯ ФЁДОРОВА (3.5 МИН)</w:t>
       </w:r>
@@ -319,7 +319,7 @@
         <w:rPr>
           <w:rFonts w:ascii="Calibri" w:hAnsi="Calibri"/>
           <w:i/>
-          <w:sz w:val="21"/>
+          <w:sz w:val="20"/>
         </w:rPr>
         <w:t>«Здравствуйте. С вами Анатолий Фёдоров.</w:t>
         <w:br/>
@@ -327,80 +327,48 @@
         <w:t>Первое, что происходит после измены или внезапной новости о разводе — это ощущение, что тело вам больше не принадлежит.</w:t>
         <w:br/>
         <w:br/>
-        <w:t>Вас может бить мелкая дрожь. В горле стоит такой ком, что невозможно проглотить даже глоток воды, а еда кажется безвкусной, как картон. Сердце колотится где-то в горле, а ночью вы просыпаетесь в три часа в холодном поту, и в голове по кругу крутится одна и та же шарманка: «Как он мог?», «С кем он сейчас?», «Что я сделала не так?».</w:t>
+        <w:t>Вас может бить мелкая дрожь. В горле стоит ком, еда кажется безвкусной. Сердце колотится, а ночью вы просыпаетесь в три часа, и в голове по кругу крутится одна и та же шарманка: «Как это могло случиться?», «Где была допущена ошибка?», «Что делать дальше?».</w:t>
         <w:br/>
         <w:br/>
-        <w:t>И в этот момент многие пугаются еще сильнее и думают: «Всё, я схожу с ума. Я не выдержу этой боли».</w:t>
+        <w:t>Мужчины в этой ситуации часто пытаются заглушить стресс работой или алкоголем, а женщины тонут в слезах и самобичевании. И те, и другие думают: «Я схожу с ума. Я не выдержу этой нагрузки».</w:t>
         <w:br/>
         <w:br/>
-        <w:t>Послушайте меня внимательно: с вами всё в порядке. Вы не сходите с ума.</w:t>
+        <w:t>Послушайте меня: с вами всё в порядке. Вы не сходите с ума.</w:t>
         <w:br/>
         <w:br/>
-        <w:t>То, что вы сейчас чувствуете — это абсолютно нормальная реакция живого организма на внезапный шок. Ваш мозг воспринял предательство точно так же, как физическое нападение. В кровь выплеснулась огромная доза адреналина и кортизола. Тело приготовилось к войне: желудок отключился (поэтому не лезет еда), мышцы шеи и челюсти спазмировались, а сон пропал, потому что мозг считает, что вы в смертельной опасности.</w:t>
+        <w:t>То, что вы чувствуете — это естественная реакция организма на внезапный удар. Мозг воспринял предательство как физическую угрозу выживанию. В кровь выброшена ударная доза адреналина и кортизола. Тело мобилизовано: пищеварение отключено, мышцы шеи и челюсти спазмированы, сон нарушен.</w:t>
         <w:br/>
         <w:br/>
-        <w:t>И пытаться сейчас «взять себя в руки» или «просто успокоиться» через силу — бесполезно. Гормоны стресса нельзя уговорить словами. Но их можно вывести через тело.</w:t>
+        <w:t>Пытаться «взять себя в руки» логикой — бесполезно. Гормоны стресса нужно вывести через тело.</w:t>
         <w:br/>
         <w:br/>
-        <w:t>Прямо сейчас мы сделаем простое упражнение, которое перезагрузит вашу нервную систему за три минуты.</w:t>
+        <w:t>Прямо сейчас выполним простое соматическое упражнение, которое снимет спазм за 3 минуты:</w:t>
+        <w:br/>
+        <w:t>1. Сядьте ровно, ладонь на живот выше пупка.</w:t>
+        <w:br/>
+        <w:t>2. Вдох через нос на 4 счета (надувая живот): 1-2-3-4.</w:t>
+        <w:br/>
+        <w:t>3. Плавный выдох через рот на 6 счетов: 1-2-3-4-5-6 (сдувая живот и роняя плечи).</w:t>
+        <w:br/>
+        <w:t>4. Пауза на 2 счета.</w:t>
         <w:br/>
         <w:br/>
-        <w:t>1. Сядьте ровно и положите одну ладонь на живот, чуть выше пупка.</w:t>
-        <w:br/>
-        <w:t>2. Сделайте спокойный вдох через нос на четыре счета: раз, два, три, четыре… надувая живот.</w:t>
-        <w:br/>
-        <w:t>3. А теперь сделайте длинный, медленный выдох через рот на шесть счетов: раз, два, три, четыре, пять, шесть… сдувая живот и роняя плечи вниз.</w:t>
-        <w:br/>
-        <w:t>4. И в самом конце выдоха сделайте короткую паузу на две секунды.</w:t>
+        <w:t>Когда выдох длиннее вдоха, нервная система переключается из режима тревоги в режим безопасности.</w:t>
         <w:br/>
         <w:br/>
-        <w:t>Когда вы делаете выдох длиннее вдоха, ваш мозг получает прямой сигнал: «Опасность миновала. Можно отпустить тормоза».</w:t>
-        <w:br/>
-        <w:br/>
-        <w:t>Делайте это дыхание прямо сейчас и повторяйте каждый раз, когда к горлу подкатывает паника. А под этим видео я прикрепил для вас памятку «Как быстро уснуть без снотворных в период стресса». Сделайте практику и нажимайте кнопку перехода к следующему шагу.»</w:t>
+        <w:t>Сделайте практику прямо сейчас. А под видео скачайте памятку «4 правила глубокого сна без снотворных в период стресса».»</w:t>
       </w:r>
     </w:p>
     <w:p>
       <w:pPr>
-        <w:spacing w:before="160" w:after="40"/>
-      </w:pPr>
-      <w:r>
-        <w:rPr>
-          <w:rFonts w:ascii="Calibri" w:hAnsi="Calibri"/>
-          <w:b/>
-          <w:color w:val="0E6E5D"/>
-          <w:sz w:val="23"/>
-        </w:rPr>
-        <w:t>2. ИНТЕРАКТИВ УРОКА 1</w:t>
-      </w:r>
-    </w:p>
-    <w:p>
-      <w:pPr>
-        <w:spacing w:after="80" w:line="276" w:lineRule="auto"/>
-      </w:pPr>
-      <w:r>
-        <w:rPr>
-          <w:rFonts w:ascii="Calibri" w:hAnsi="Calibri"/>
-          <w:i w:val="0"/>
-          <w:sz w:val="21"/>
-        </w:rPr>
-        <w:t>• Экранный таймер антистресс-дыхания: Вдох (4 сек) ➔ Выдох (6 сек) ➔ Пауза (2 сек).</w:t>
-        <w:br/>
-        <w:t>• Скачиваемый материал: Памятка «4 шага к глубокому сну без снотворных при остром стрессе».</w:t>
-        <w:br/>
-        <w:t>• Кнопка: [🧭 Дрожь отпустила • Перехожу к Уроку 2]</w:t>
-      </w:r>
-    </w:p>
-    <w:p>
-      <w:pPr>
-        <w:spacing w:before="280" w:after="80"/>
+        <w:spacing w:before="240" w:after="60"/>
       </w:pPr>
       <w:r>
         <w:rPr>
           <w:rFonts w:ascii="Calibri" w:hAnsi="Calibri"/>
           <w:b/>
           <w:color w:val="1F4E5B"/>
-          <w:sz w:val="26"/>
+          <w:sz w:val="25"/>
         </w:rPr>
         <w:t>УРОК 2: ДВЕ НЕДЕЛИ ТИШИНЫ: О ЧЕМ НЕЛЬЗЯ ГОВОРИТЬ, ЧТОБЫ НЕ УНИЗИТЬСЯ И НЕ СДЕЛАТЬ ХУЖЕ</w:t>
       </w:r>
@@ -414,7 +382,7 @@
           <w:rFonts w:ascii="Calibri" w:hAnsi="Calibri"/>
           <w:b/>
           <w:color w:val="0E6E5D"/>
-          <w:sz w:val="23"/>
+          <w:sz w:val="22"/>
         </w:rPr>
         <w:t>1. ТЕКСТ СУФЛЁРА ДЛЯ ВИДЕО АНАТОЛИЯ ФЁДОРОВА (4 МИН)</w:t>
       </w:r>
@@ -427,82 +395,48 @@
         <w:rPr>
           <w:rFonts w:ascii="Calibri" w:hAnsi="Calibri"/>
           <w:i/>
-          <w:sz w:val="21"/>
+          <w:sz w:val="20"/>
         </w:rPr>
         <w:t>«Здравствуйте. С вами Анатолий Фёдоров.</w:t>
         <w:br/>
         <w:br/>
-        <w:t>Сегодня мы разберем самый опасный этап кризиса — первые две недели. Именно в эти 14 дней совершается 90% непоправимых ошибок, о которых потом мучительно жалеют годами.</w:t>
+        <w:t>Сегодня мы разберем самый опасный этап — первые 14 дней. Именно в эти две недели совершается большинство непоправимых ошибок.</w:t>
         <w:br/>
         <w:br/>
-        <w:t>Что тянет сделать человека в состоянии шока?</w:t>
+        <w:t>Какие 3 ошибки совершают чаще всего?</w:t>
         <w:br/>
-        <w:t>Первое — начать ночные многочасовые допросы с пристрастием: «Расскажи в деталях, как это было! Где вы были? Что она тебе говорила? Ты ее любишь?». Вы надеетесь, что от этих ответов вам станет легче. Но правда в том, что каждая новая деталь вонзается в сердце как раскаленный нож и начинает крутиться в голове бесконечным фильмом ужасов.</w:t>
+        <w:t>1. Ночные допросы с пристрастием: «Расскажи всё в подробностях! Кто это? Сколько это длится? Ты меня вообще уважал(а)?». Правда в том, что новые подробности не приносят облегчения, а превращаются в навязчивые мысленные картины, которые травмируют еще глубже.</w:t>
+        <w:br/>
+        <w:t>2. Тотальная слежка: проверка телефонов, переписок, локаций, соцсетей третьей стороны. Это сжигает остатки ваших нервов и убивает самооценку.</w:t>
+        <w:br/>
+        <w:t>3. Крайности поведения: либо агрессивные угрозы «я тебя уничтожу и оставлю без копейки», либо унизительные мольбы «я всё прощу, только не уходи». Агрессия ожесточает партнера, а мольбы вызывают жалость и раздражение.</w:t>
         <w:br/>
         <w:br/>
-        <w:t>Второе — тотальная слежка. Проверка телефона по ночам, геолокации, чтение переписок, мониторинг соцсетей соперницы. Это превращает вашу жизнь в персональный ад и полностью уничтожает остатки вашей самооценки.</w:t>
+        <w:t>Поэтому мы вводим жесткое «Правило 14 дней»:</w:t>
+        <w:br/>
+        <w:t>— Мораторий на глобальные разговоры о будущем на 2 недели: «Мне нужно время восстановить равновесие. Мы вернемся к этому позже».</w:t>
+        <w:br/>
+        <w:t>— Полный отказ от слежки в гаджетах.</w:t>
+        <w:br/>
+        <w:t>— Сухой, спокойный деловой контакт по текущему быту и детям.</w:t>
         <w:br/>
         <w:br/>
-        <w:t>И третье — унизительные мольбы: «Я всё прощу, я изменюсь, только не уходи!». Запомните: жалость никогда не вызывает уважения и любви. Она вызывает только раздражение и желание сбежать еще дальше.</w:t>
+        <w:t>Это не игра в обиды. Это создание безопасной дистанции, чтобы остановить потерю сил и сохранить достоинство.</w:t>
         <w:br/>
         <w:br/>
-        <w:t>Поэтому прямо сегодня мы вводим железное «Правило 14 дней».</w:t>
-        <w:br/>
-        <w:br/>
-        <w:t>1. Полный мораторий на обсуждение будущего брака на две недели. Никаких «давай поговорим, что нам делать дальше». Спокойный ответ: «Мне нужно время, чтобы прийти в себя и всё обдумать. Мы вернемся к этому разговору позже».</w:t>
-        <w:br/>
-        <w:t>2. Категорический запрет на слежку. Удалите закладки на чужие страницы. Не ищите детали — они не лечат, они травмируют.</w:t>
-        <w:br/>
-        <w:t>3. Сухой деловой контакт по быту и детям. Без слез, без упреков и без заискивания.</w:t>
-        <w:br/>
-        <w:br/>
-        <w:t>Это не игра в молчанку. Это создание защитного купола вокруг вашей психики, чтобы вы перестали сливать энергию и вернули себе контроль над ситуацией.</w:t>
-        <w:br/>
-        <w:br/>
-        <w:t>Под видео скачайте шпаргалку «3 фразы, которые останавливают провокации партнера и сохраняют ваше достоинство». Изучите их и переходите к Уроку 3.»</w:t>
+        <w:t>Под видео вас ждет памятка «3 готовые фразы, которые останавливают провокации партнера и сохраняют вашу позицию».»</w:t>
       </w:r>
     </w:p>
     <w:p>
       <w:pPr>
-        <w:spacing w:before="160" w:after="40"/>
-      </w:pPr>
-      <w:r>
-        <w:rPr>
-          <w:rFonts w:ascii="Calibri" w:hAnsi="Calibri"/>
-          <w:b/>
-          <w:color w:val="0E6E5D"/>
-          <w:sz w:val="23"/>
-        </w:rPr>
-        <w:t>2. ИНТЕРАКТИВ УРОКА 2</w:t>
-      </w:r>
-    </w:p>
-    <w:p>
-      <w:pPr>
-        <w:spacing w:after="80" w:line="276" w:lineRule="auto"/>
-      </w:pPr>
-      <w:r>
-        <w:rPr>
-          <w:rFonts w:ascii="Calibri" w:hAnsi="Calibri"/>
-          <w:i w:val="0"/>
-          <w:sz w:val="21"/>
-        </w:rPr>
-        <w:t>• Интерактивный чек-лист: «Детектор роковых ошибок: проверяем свои действия» (3 вопроса: допросы, слежка, мольбы).</w:t>
-        <w:br/>
-        <w:t>• Скачиваемый материал: Шпаргалка «3 готовые формулировки для защиты своего достоинства в разговоре с партнером».</w:t>
-        <w:br/>
-        <w:t>• Кнопка: [🧭 Правило тишины принято • Перехожу к Уроку 3]</w:t>
-      </w:r>
-    </w:p>
-    <w:p>
-      <w:pPr>
-        <w:spacing w:before="280" w:after="80"/>
+        <w:spacing w:before="240" w:after="60"/>
       </w:pPr>
       <w:r>
         <w:rPr>
           <w:rFonts w:ascii="Calibri" w:hAnsi="Calibri"/>
           <w:b/>
           <w:color w:val="1F4E5B"/>
-          <w:sz w:val="26"/>
+          <w:sz w:val="25"/>
         </w:rPr>
         <w:t>УРОК 3: ЗАЩИТА ЛИЧНЫХ ГРАНИЦ: КАК НЕ СТАТЬ ЖЕРТВОЙ МАНИПУЛЯЦИЙ И СПЛЕТЕН</w:t>
       </w:r>
@@ -516,7 +450,7 @@
           <w:rFonts w:ascii="Calibri" w:hAnsi="Calibri"/>
           <w:b/>
           <w:color w:val="0E6E5D"/>
-          <w:sz w:val="23"/>
+          <w:sz w:val="22"/>
         </w:rPr>
         <w:t>1. ТЕКСТ СУФЛЁРА ДЛЯ ВИДЕО АНАТОЛИЯ ФЁДОРОВА (4 МИН)</w:t>
       </w:r>
@@ -529,79 +463,43 @@
         <w:rPr>
           <w:rFonts w:ascii="Calibri" w:hAnsi="Calibri"/>
           <w:i/>
-          <w:sz w:val="21"/>
+          <w:sz w:val="20"/>
         </w:rPr>
         <w:t>«Здравствуйте. С вами Анатолий Фёдоров.</w:t>
         <w:br/>
         <w:br/>
-        <w:t>Когда в семье происходит шторм, вокруг него моментально возникает водоворот из других людей. И если не выставить жесткие границы, этот водоворот разорвет вас на куски.</w:t>
+        <w:t>В семейный шторм всегда пытается вмешаться окружение. И если не выставить границы, чужие советы разорвут вас на части.</w:t>
         <w:br/>
         <w:br/>
-        <w:t>Кто начинает лезть в вашу ситуацию?</w:t>
+        <w:t>1. Родственники и друзья. Одни кричат: «Немедленно выгоняй!», другие: «Терпи ради детей и статуса!». Помните: люди советуют из своего опыта и страхов. Жить с последствиями предстоит вам.</w:t>
         <w:br/>
-        <w:t>Первое — сердобольные родственники и подруги. Одни кричат: «Гони его в шею, все мужики козлы!», вторые шепчут: «Терпи ради детей, кому ты будешь нужна в сорок лет!». Запомните: все эти люди советуют из своих собственных страхов и травм. Жить с последствиями этих советов придется вам, а не им.</w:t>
+        <w:t>2. Третья сторона и попытки манипуляций: «Ты сам(а) виноват(а), что в семье всё рухнуло». Это попытка переложить ответственность за свой поступок на вас. Измена или уход — это персональный выбор взрослого человека, а не ваша вина.</w:t>
+        <w:br/>
+        <w:t>3. Дети. Главное табу — делать ребенка союзником в борьбе против второго родителя: «Посмотри, что твой отец/мать натворили». Ребенок любит обоих. Втягивая его в войну, вы наносите ему тяжелейшую травму.</w:t>
         <w:br/>
         <w:br/>
-        <w:t>Второе — третья сторона (любовник или любовница). Часто партнер начинает сравнивать: «А вот она меня понимает, а ты вечно пилишь». Это классическая манипуляция, чтобы переложить вину за свой поступок на вас: «Ты сама виновата, что я пошел на сторону».</w:t>
+        <w:t>Ваши правила защиты:</w:t>
+        <w:br/>
+        <w:t>— Для советчиков: «Спасибо за участие, но мы разберемся сами. Я не обсуждаю это».</w:t>
+        <w:br/>
+        <w:t>— Для партнера: твердый возврат ответственности без перехода на личности.</w:t>
+        <w:br/>
+        <w:t>— Для детей: спокойная родительская позиция: «Мы оба тебя любим, ты ни в чем не виноват(а), взрослые вопросы мы решим сами».</w:t>
         <w:br/>
         <w:br/>
-        <w:t>И самое уязвимое звено — это дети. Самая страшная ошибка — сделать ребенка своим союзником или жилеткой для слез: «Посмотри, как твой отец с нами поступил». Ребенок любит обоих родителей. Втягивая его в войну, вы наносите ему тяжелейшую психологическую травму на всю жизнь.</w:t>
-        <w:br/>
-        <w:br/>
-        <w:t>Как выстроить железобетонный забор вокруг своей территории?</w:t>
-        <w:br/>
-        <w:br/>
-        <w:t>1. Правило закрытой двери для советчиков: «Спасибо за заботу, но мы разберемся сами. Я не готова это обсуждать».</w:t>
-        <w:br/>
-        <w:t>2. Возврат вины автору поступка: Измена или уход — это личный выбор взрослого человека, а не ваша вина. Не берите на себя ответственность за чужие решения.</w:t>
-        <w:br/>
-        <w:t>3. Дети — вне зоны боевых действий: «Мы с папой сейчас переживаем сложный период как взрослые. Но мы оба тебя очень любим, и для тебя ничего не изменится».</w:t>
-        <w:br/>
-        <w:br/>
-        <w:t>Под видео вас ждет специальная 10-минутная аудиопрактика «Эмоциональный щит», которая поможет вам выстроить внутреннюю броню от чужих нападок и манипуляций. Прослушайте ее перед переходом к Уроку 4.»</w:t>
+        <w:t>Под видео вас ждет 10-минутная аудиопрактика «Эмоциональный щит: как не принимать чужую вину на себя».»</w:t>
       </w:r>
     </w:p>
     <w:p>
       <w:pPr>
-        <w:spacing w:before="160" w:after="40"/>
-      </w:pPr>
-      <w:r>
-        <w:rPr>
-          <w:rFonts w:ascii="Calibri" w:hAnsi="Calibri"/>
-          <w:b/>
-          <w:color w:val="0E6E5D"/>
-          <w:sz w:val="23"/>
-        </w:rPr>
-        <w:t>2. АУДИОПРАКТИКА УРОКА 3</w:t>
-      </w:r>
-    </w:p>
-    <w:p>
-      <w:pPr>
-        <w:spacing w:after="80" w:line="276" w:lineRule="auto"/>
-      </w:pPr>
-      <w:r>
-        <w:rPr>
-          <w:rFonts w:ascii="Calibri" w:hAnsi="Calibri"/>
-          <w:i w:val="0"/>
-          <w:sz w:val="21"/>
-        </w:rPr>
-        <w:t>🎧 Аудиопрактика «Эмоциональный щит: как не принимать чужую вину на себя» (10 минут).</w:t>
-        <w:br/>
-        <w:t>Гипнотическая сессия Анатолия на отделение себя от манипуляций партнера и давления окружающих.</w:t>
-        <w:br/>
-        <w:t>• Кнопка: [🧭 Границы выставлены • Перехожу к Уроку 4]</w:t>
-      </w:r>
-    </w:p>
-    <w:p>
-      <w:pPr>
-        <w:spacing w:before="280" w:after="80"/>
+        <w:spacing w:before="240" w:after="60"/>
       </w:pPr>
       <w:r>
         <w:rPr>
           <w:rFonts w:ascii="Calibri" w:hAnsi="Calibri"/>
           <w:b/>
           <w:color w:val="1F4E5B"/>
-          <w:sz w:val="26"/>
+          <w:sz w:val="25"/>
         </w:rPr>
         <w:t>УРОК 4: СМОТРИМ ПРАВДЕ В ГЛАЗА: ЕСТЬ ЛИ ШАНС ВСЁ ИСПРАВИТЬ ИЛИ ЭТО КОНЕЦ</w:t>
       </w:r>
@@ -615,7 +513,7 @@
           <w:rFonts w:ascii="Calibri" w:hAnsi="Calibri"/>
           <w:b/>
           <w:color w:val="0E6E5D"/>
-          <w:sz w:val="23"/>
+          <w:sz w:val="22"/>
         </w:rPr>
         <w:t>1. ТЕКСТ СУФЛЁРА ДЛЯ ВИДЕО АНАТОЛИЯ ФЁДОРОВА (4.5 МИН)</w:t>
       </w:r>
@@ -628,83 +526,48 @@
         <w:rPr>
           <w:rFonts w:ascii="Calibri" w:hAnsi="Calibri"/>
           <w:i/>
-          <w:sz w:val="21"/>
+          <w:sz w:val="20"/>
         </w:rPr>
         <w:t>«Здравствуйте. С вами Анатолий Фёдоров.</w:t>
         <w:br/>
         <w:br/>
-        <w:t>Когда первые эмоции улеглись, дрожь в теле прошла и границы выставлены — наступает время трезвого аудита. Без розовых очков и без самообмана.</w:t>
+        <w:t>Когда острое напряжение снято и эмоции улеглись, наступает время трезвой оценки фактов. Отношения можно восстанавливать только тогда, когда есть ЧТО сохранять и есть С КЕМ сохранять.</w:t>
         <w:br/>
         <w:br/>
-        <w:t>Вам нужно понять реальное положение дел. Отношения можно спасти только тогда, когда есть ЧТО спасать и есть С КЕМ спасать.</w:t>
+        <w:t>Разделим ситуации на две категории:</w:t>
         <w:br/>
         <w:br/>
-        <w:t>Давайте разделим все ситуации на две категории.</w:t>
+        <w:t>1. «Кризис, где есть ресурс для восстановления»:</w:t>
+        <w:br/>
+        <w:t>— Партнер полностью прекратил контакты на стороне, признает ответственность и не перекладывает вину;</w:t>
+        <w:br/>
+        <w:t>— Он(она) готов(а) к открытому диалогу, уважает ваше время на проживание боли и готов(а) восстанавливать доверие делами;</w:t>
+        <w:br/>
+        <w:t>— Сохраняется взаимное уважение и обоюдное желание сохранить союз.</w:t>
         <w:br/>
         <w:br/>
-        <w:t>Категория 1: «Кризис, в котором есть шанс». Это ситуация, когда:</w:t>
+        <w:t>2. «Тупик, где происходит разрушение личности»:</w:t>
         <w:br/>
-        <w:t>— Партнер искренне признает свою вину, не перекладывает ответственность на вас и прекратил всякий контакт на стороне;</w:t>
+        <w:t>— Партнер продолжает скрывать контакты, живет на два фронта и кормит завтраками;</w:t>
         <w:br/>
-        <w:t>— Он готов отвечать на ваши вопросы, уважает ваши правила и готов восстанавливать доверие шаг за шагом;</w:t>
+        <w:t>— Обесценивает ваши чувства: «Ты всё выдумываешь, хватит устраивать драму»;</w:t>
         <w:br/>
-        <w:t>— Между вами, помимо боли, остается общее ценностное поле, уважение и обоюдное желание быть вместе.</w:t>
+        <w:t>— Использует семью только ради удобства, статуса или финансов, не давая тепла и уважения.</w:t>
         <w:br/>
         <w:br/>
-        <w:t>Категория 2: «Тупик, где вас разрушают». Это ситуация, когда:</w:t>
-        <w:br/>
-        <w:t>— Партнер продолжает врать, держать вас на коротком поводке и жить на две семьи;</w:t>
-        <w:br/>
-        <w:t>— Он обесценивает вашу боль: «Ой, да подумаешь, ничего особенного, хватит психовать»;</w:t>
-        <w:br/>
-        <w:t>— Вас используют как удобную прислугу или кошелек, не давая взамен ни тепла, ни уважения.</w:t>
-        <w:br/>
-        <w:br/>
-        <w:t>Жить годами в надежде, что человек «вдруг одумается», пока об вас вытирают ноги — это медленное самоубийство.</w:t>
-        <w:br/>
-        <w:br/>
-        <w:t>Под этим видео я прикрепил интерактивный тренажер «Холодный аудит отношений». Ответьте честно на 5 ключевых вопросов. Это поможет вам увидеть факты, очищенные от страха и иллюзий. Выполните задание и переходите к финальному Уроку 5.»</w:t>
+        <w:t>Под видео пройдите интерактивный тренажер «Аудит реальности: Факты против Иллюзий». 5 прямых вопросов помогут увидеть ситуацию без страха и самообмана.»</w:t>
       </w:r>
     </w:p>
     <w:p>
       <w:pPr>
-        <w:spacing w:before="160" w:after="40"/>
-      </w:pPr>
-      <w:r>
-        <w:rPr>
-          <w:rFonts w:ascii="Calibri" w:hAnsi="Calibri"/>
-          <w:b/>
-          <w:color w:val="0E6E5D"/>
-          <w:sz w:val="23"/>
-        </w:rPr>
-        <w:t>2. ИНТЕРАКТИВ УРОКА 4</w:t>
-      </w:r>
-    </w:p>
-    <w:p>
-      <w:pPr>
-        <w:spacing w:after="80" w:line="276" w:lineRule="auto"/>
-      </w:pPr>
-      <w:r>
-        <w:rPr>
-          <w:rFonts w:ascii="Calibri" w:hAnsi="Calibri"/>
-          <w:i w:val="0"/>
-          <w:sz w:val="21"/>
-        </w:rPr>
-        <w:t>• Интерактивный опросник «Аудит реальности: Факты против Иллюзий» (5 тестовых ситуаций с автоматическим определением шанса на восстановление союза).</w:t>
-        <w:br/>
-        <w:t>• Кнопка: [🧭 Картина ясна • Перехожу к финальному Уроку 5]</w:t>
-      </w:r>
-    </w:p>
-    <w:p>
-      <w:pPr>
-        <w:spacing w:before="280" w:after="80"/>
+        <w:spacing w:before="240" w:after="60"/>
       </w:pPr>
       <w:r>
         <w:rPr>
           <w:rFonts w:ascii="Calibri" w:hAnsi="Calibri"/>
           <w:b/>
           <w:color w:val="1F4E5B"/>
-          <w:sz w:val="26"/>
+          <w:sz w:val="25"/>
         </w:rPr>
         <w:t>УРОК 5: СПАСАТЬ СЕМЬЮ ПО НОВЫМ ПРАВИЛАМ ИЛИ СПОКОЙНО УЙТИ С ВЫСОКО ПОДНЯТОЙ ГОЛОВОЙ</w:t>
       </w:r>
@@ -718,7 +581,7 @@
           <w:rFonts w:ascii="Calibri" w:hAnsi="Calibri"/>
           <w:b/>
           <w:color w:val="0E6E5D"/>
-          <w:sz w:val="23"/>
+          <w:sz w:val="22"/>
         </w:rPr>
         <w:t>1. ТЕКСТ СУФЛЁРА ДЛЯ ВИДЕО АНАТОЛИЯ ФЁДОРОВА (4.5 МИН)</w:t>
       </w:r>
@@ -731,44 +594,51 @@
         <w:rPr>
           <w:rFonts w:ascii="Calibri" w:hAnsi="Calibri"/>
           <w:i/>
-          <w:sz w:val="21"/>
+          <w:sz w:val="20"/>
         </w:rPr>
-        <w:t>«Здравствуйте. С вами Анатолий Фёдоров. Мы подошли к главному шагу нашего пути — к точке вашего осознанного выбора.</w:t>
+        <w:t>«Здравствуйте. С вами Анатолий Фёдоров. Мы подошли к точке осознанного выбора.</w:t>
         <w:br/>
         <w:br/>
-        <w:t>За эти дни вы проделали огромную работу: остановили панику, защитили себя от глупостей, выставили границы и посмотрели правде в глаза. Теперь перед вами развилка из двух дорог. И какую бы дорогу вы ни выбрали — вы выберете ее из состояния силы и достоинства, а не из беспомощности.</w:t>
+        <w:t>За эти дни вы проделали серьезную внутреннюю работу: остановили панику, выдержали паузу и трезво оценили ситуацию. Теперь перед вами два пути. И какой бы путь вы ни выбрали — вы выберете его из взрослой позиции и собственного достоинства.</w:t>
         <w:br/>
         <w:br/>
-        <w:t>ПУТЬ 1: Если вы оба решаете сохранить брак.</w:t>
+        <w:t>ПУТЬ 1: Если вы оба решаете сохранить семью.</w:t>
         <w:br/>
-        <w:t>Запомните главное правило: «Как раньше» уже никогда не будет. Прежний брак умер в момент предательства. Но на его месте можно построить новый, взрослый союз.</w:t>
+        <w:t>«Как раньше» уже не будет — прежняя модель отношений исчерпала себя. Но можно выстроить новый зрелый союз:</w:t>
         <w:br/>
-        <w:t>Для этого нужны 3 жестких условия:</w:t>
+        <w:t>1. Полная прозрачность и оборванные связи с прошлым.</w:t>
         <w:br/>
-        <w:t>1. Полная прозрачность и оборванные контакты с прошлым.</w:t>
+        <w:t>2. Отказ от бесконечных попреков: если принято решение двигаться вместе — измена не превращается в инструмент вечного шантажа.</w:t>
         <w:br/>
-        <w:t>2. Мораторий на бесконечные упреки: если простили — не превращайте измену в вечное оружие для шантажа.</w:t>
-        <w:br/>
-        <w:t>3. Заключение «Нового семейного пакта» с четкими правилами уважения и личных границ.</w:t>
+        <w:t>3. Новый семейный пакт с понятными правилами уважения и взаимных обязательств.</w:t>
         <w:br/>
         <w:br/>
-        <w:t>ПУТЬ 2: Если вы решаете расстаться.</w:t>
+        <w:t>ПУТЬ 2: Если вы принимаете решение расстаться.</w:t>
         <w:br/>
-        <w:t>Развод — это не конец жизни. Это окончание тяжелого и деструктивного этапа. Вы выходите из этих отношений не жертвой, а человеком, который выбрал себя, свое здоровье и будущее своих детей.</w:t>
+        <w:t>Развод — это не катастрофа всей жизни, а завершение сложного этапа. Вы выходите не жертвой, а человеком, который выбирает свое здоровье, самоуважение и будущее детей:</w:t>
         <w:br/>
-        <w:t>Главные правила цивилизованного выхода:</w:t>
+        <w:t>1. Спокойный деловой подход к имуществу, финансам и документам без войны.</w:t>
         <w:br/>
-        <w:t>1. Холодный деловой подход: имущество и алименты решаются через документы и юристов, а не через ночные истерики.</w:t>
+        <w:t>2. Четкое разделение: супружеские отношения завершены, но родительское партнерство сохраняется.</w:t>
         <w:br/>
-        <w:t>2. Сохранение родительской позиции: вы перестаете быть мужем и женой, но остаетесь родителями.</w:t>
-        <w:br/>
-        <w:t>3. Возврат своей жизни: фокус на своем теле, карьере, увлечениях и создании нового счастливого круга общения.</w:t>
+        <w:t>3. Фокус на восстановлении своей энергии, здоровья и личных целей.</w:t>
         <w:br/>
         <w:br/>
-        <w:t>Вы справились со штормом. Вы выстояли. И теперь опора внутри вас никуда не денется.</w:t>
-        <w:br/>
-        <w:br/>
-        <w:t>Под этим видео вас ждет главная восстанавливающая аудиопрактика курса «Моя нерушимая опора» и пакет из 4 специальных бонусов. Я желаю вам спокойствия, ясности и твердости духа. До встречи!»</w:t>
+        <w:t>Под видео вас ждет главная восстанавливающая аудиопрактика «Моя нерушимая опора» и пакет из 4 бонусов. Спокойствия вам, ясности и твердости духа. До встречи!»</w:t>
+      </w:r>
+    </w:p>
+    <w:p>
+      <w:pPr>
+        <w:spacing w:before="240" w:after="60"/>
+      </w:pPr>
+      <w:r>
+        <w:rPr>
+          <w:rFonts w:ascii="Calibri" w:hAnsi="Calibri"/>
+          <w:b/>
+          <w:color w:val="1F4E5B"/>
+          <w:sz w:val="25"/>
+        </w:rPr>
+        <w:t>ПАКЕТ 4-Х УНИКАЛЬНЫХ БОНУСОВ КУРСА</w:t>
       </w:r>
     </w:p>
     <w:p>
@@ -780,9 +650,9 @@
           <w:rFonts w:ascii="Calibri" w:hAnsi="Calibri"/>
           <w:b/>
           <w:color w:val="0E6E5D"/>
-          <w:sz w:val="23"/>
+          <w:sz w:val="22"/>
         </w:rPr>
-        <w:t>2. ГЛАВНАЯ АУДИОПРАКТИКА УРОКА 5</w:t>
+        <w:t>БОНУС 1: «Антипаника: как сказать детям о кризисе или разводе без детских травм»</w:t>
       </w:r>
     </w:p>
     <w:p>
@@ -793,25 +663,13 @@
         <w:rPr>
           <w:rFonts w:ascii="Calibri" w:hAnsi="Calibri"/>
           <w:i w:val="0"/>
-          <w:sz w:val="21"/>
+          <w:sz w:val="20"/>
         </w:rPr>
-        <w:t>🎧 Аудиопрактика «Моя нерушимая опора: возвращение силы и достоинства» (12 минут).</w:t>
+        <w:t>• Возрастные формулировки разговора (3–6 лет, 7–12 лет, подростки 13–17 лет).</w:t>
         <w:br/>
-        <w:t>Глубокая гипнотическая сессия на закрепление автономии, спокойной уверенности и веры в счастливое будущее.</w:t>
-      </w:r>
-    </w:p>
-    <w:p>
-      <w:pPr>
-        <w:spacing w:before="280" w:after="80"/>
-      </w:pPr>
-      <w:r>
-        <w:rPr>
-          <w:rFonts w:ascii="Calibri" w:hAnsi="Calibri"/>
-          <w:b/>
-          <w:color w:val="1F4E5B"/>
-          <w:sz w:val="26"/>
-        </w:rPr>
-        <w:t>ПАКЕТ 4-Х УНИКАЛЬНЫХ БОНУСОВ КУРСА (БЕЗ ДУБЛИРОВАНИЯ)</w:t>
+        <w:t>• 5 табу: о чем нельзя говорить ребенку.</w:t>
+        <w:br/>
+        <w:t>• Как реагировать на детские слезы и вопросы без вранья и чувства вины.</w:t>
       </w:r>
     </w:p>
     <w:p>
@@ -823,9 +681,9 @@
           <w:rFonts w:ascii="Calibri" w:hAnsi="Calibri"/>
           <w:b/>
           <w:color w:val="0E6E5D"/>
-          <w:sz w:val="23"/>
+          <w:sz w:val="22"/>
         </w:rPr>
-        <w:t>БОНУС 1: «Антипаника: как сказать детям о разводе или паузе без детских травм»</w:t>
+        <w:t>БОНУС 2: «Новый семейный пакт: 5 правил восстановления доверия после измены»</w:t>
       </w:r>
     </w:p>
     <w:p>
@@ -836,13 +694,13 @@
         <w:rPr>
           <w:rFonts w:ascii="Calibri" w:hAnsi="Calibri"/>
           <w:i w:val="0"/>
-          <w:sz w:val="21"/>
+          <w:sz w:val="20"/>
         </w:rPr>
-        <w:t>• Точные возрастные скрипты разговора с детьми (3–6 лет, 7–12 лет, подростки 13–17 лет).</w:t>
+        <w:t>• Протокол прозрачности без унизительной тотальной слежки.</w:t>
         <w:br/>
-        <w:t>• 5 категорических запретов: чего никогда нельзя говорить ребенку о втором родителе.</w:t>
+        <w:t>• Правило постепенного сближения: шаги возвращения тепла.</w:t>
         <w:br/>
-        <w:t>• Как реагировать на детские слезы, агрессию и вопросы: «Вы помиритесь?» без вранья и чувства вины.</w:t>
+        <w:t>• Эмоциональный и практический договор пары на 6 месяцев.</w:t>
       </w:r>
     </w:p>
     <w:p>
@@ -854,9 +712,9 @@
           <w:rFonts w:ascii="Calibri" w:hAnsi="Calibri"/>
           <w:b/>
           <w:color w:val="0E6E5D"/>
-          <w:sz w:val="23"/>
+          <w:sz w:val="22"/>
         </w:rPr>
-        <w:t>БОНУС 2: «Новый семейный пакт: 5 жестких правил восстановления доверия после измены»</w:t>
+        <w:t>БОНУС 3: «Юридическая и финансовая безопасность при разводе»</w:t>
       </w:r>
     </w:p>
     <w:p>
@@ -867,13 +725,13 @@
         <w:rPr>
           <w:rFonts w:ascii="Calibri" w:hAnsi="Calibri"/>
           <w:i w:val="0"/>
-          <w:sz w:val="21"/>
+          <w:sz w:val="20"/>
         </w:rPr>
-        <w:t>• Протокол прозрачности для партнера (гаджеты, задержки на работе, поездки) без унизительного тотального контроля.</w:t>
+        <w:t>• Чек-лист подготовки документов, фиксации счетов и активов.</w:t>
         <w:br/>
-        <w:t>• Правило постепенного сближения: как вернуть физический контакт и объятия, когда обида еще не ушла.</w:t>
+        <w:t>• Как оформить нотариальное соглашение по детям и имуществу без судов и войны.</w:t>
         <w:br/>
-        <w:t>• Юридический и эмоциональный договор пары на 6 месяцев испытательного срока.</w:t>
+        <w:t>• 3 типичные ошибки, из-за которых мужчины и женщины теряют ресурсы при расставании.</w:t>
       </w:r>
     </w:p>
     <w:p>
@@ -885,9 +743,9 @@
           <w:rFonts w:ascii="Calibri" w:hAnsi="Calibri"/>
           <w:b/>
           <w:color w:val="0E6E5D"/>
-          <w:sz w:val="23"/>
+          <w:sz w:val="22"/>
         </w:rPr>
-        <w:t>БОНУС 3: «Юридическая и финансовая безопасность: как защитить активы, жилье и алименты»</w:t>
+        <w:t>БОНУС 4: «Выход из любовного треугольника: как перестать терпеть двойную жизнь»</w:t>
       </w:r>
     </w:p>
     <w:p>
@@ -898,44 +756,13 @@
         <w:rPr>
           <w:rFonts w:ascii="Calibri" w:hAnsi="Calibri"/>
           <w:i w:val="0"/>
-          <w:sz w:val="21"/>
+          <w:sz w:val="20"/>
         </w:rPr>
-        <w:t>• Пошаговый чек-лист подготовки к разводу без паники: сбор документов, выписки со счетов, фиксация имущества.</w:t>
+        <w:t>• Психология «двойной жизни»: почему партнер сидит на двух стульях.</w:t>
         <w:br/>
-        <w:t>• Как цивилизованно договориться об алиментах и порядке общения с детьми через нотариальное соглашение, избегая судов и грязных споров.</w:t>
+        <w:t>• Техника установления твердого дедлайна без истерик.</w:t>
         <w:br/>
-        <w:t>• 3 финансовые ошибки, из-за которых женщины и мужчины теряют имущество при разводе.</w:t>
-      </w:r>
-    </w:p>
-    <w:p>
-      <w:pPr>
-        <w:spacing w:before="160" w:after="40"/>
-      </w:pPr>
-      <w:r>
-        <w:rPr>
-          <w:rFonts w:ascii="Calibri" w:hAnsi="Calibri"/>
-          <w:b/>
-          <w:color w:val="0E6E5D"/>
-          <w:sz w:val="23"/>
-        </w:rPr>
-        <w:t>БОНУС 4: «Выход из любовного треугольника: как перестать быть третьим лишним или терпеть двойную жизнь»</w:t>
-      </w:r>
-    </w:p>
-    <w:p>
-      <w:pPr>
-        <w:spacing w:after="80" w:line="276" w:lineRule="auto"/>
-      </w:pPr>
-      <w:r>
-        <w:rPr>
-          <w:rFonts w:ascii="Calibri" w:hAnsi="Calibri"/>
-          <w:i w:val="0"/>
-          <w:sz w:val="21"/>
-        </w:rPr>
-        <w:t>• Психология «двойной жизни»: почему партнер годами сидит на двух стульях и кормит завтраками.</w:t>
-        <w:br/>
-        <w:t>• Техника жесткого ультиматума с установлением дедлайна: как поставить вопрос ребром и не сорваться.</w:t>
-        <w:br/>
-        <w:t>• Как пережить синдром отмены и ломку при разрыве токсичной любовной связи.</w:t>
+        <w:t>• Преодоление ломки и синдрома отмены при выходе из токсичной связи.</w:t>
       </w:r>
     </w:p>
     <w:sectPr>

</xml_diff>

<commit_message>
scenario 4: add speaker director cards with exact metamessages, emotional roles and body language for 100% course completion rate
</commit_message>
<xml_diff>
--- a/baza/исходник миникурса/4 сценарий/Сценарий_4_Точка_опоры_ПОЛНЫЙ_КУРС.docx
+++ b/baza/исходник миникурса/4 сценарий/Сценарий_4_Точка_опоры_ПОЛНЫЙ_КУРС.docx
@@ -29,7 +29,7 @@
           <w:color w:val="555555"/>
           <w:sz w:val="21"/>
         </w:rPr>
-        <w:t>Генеральный мастер-пакет: видео-суфлеры, аудиопрактики, интерактивы и бонусы (Гендерно-сбалансированная редакция для мужчин и женщин)</w:t>
+        <w:t>Мастер-пакет с режиссёрскими картами спикера (Метасообщения, эмоции, темп голоса и доходимость до конца)</w:t>
         <w:br/>
         <w:t>Автор: Федоров Анатолий Игоревич (Семейный психолог, гипнолог, проректор МАГиГ)</w:t>
       </w:r>
@@ -144,6 +144,56 @@
           <w:sz w:val="25"/>
         </w:rPr>
         <w:t>УРОК 0: СТОП-КРАН И ЭКСТРЕННОЕ ЗАЗЕМЛЕНИЕ</w:t>
+      </w:r>
+    </w:p>
+    <w:p>
+      <w:pPr>
+        <w:spacing w:before="120" w:after="80"/>
+        <w:ind w:left="288"/>
+      </w:pPr>
+      <w:r>
+        <w:rPr>
+          <w:rFonts w:ascii="Calibri" w:hAnsi="Calibri"/>
+          <w:b/>
+          <w:color w:val="C0392B"/>
+          <w:sz w:val="20"/>
+        </w:rPr>
+        <w:t>🎬 РЕЖИССЁРСКАЯ КАРТА СПИКЕРА (КАК ВЕСТИ ЭТОТ УРОК):</w:t>
+        <w:br/>
+      </w:r>
+      <w:r>
+        <w:rPr>
+          <w:rFonts w:ascii="Calibri" w:hAnsi="Calibri"/>
+          <w:b/>
+          <w:sz w:val="19"/>
+        </w:rPr>
+        <w:t>• Роль спикера: Опытный врач-реаниматолог / Спокойный капитан корабля в шторм</w:t>
+        <w:br/>
+      </w:r>
+      <w:r>
+        <w:rPr>
+          <w:rFonts w:ascii="Calibri" w:hAnsi="Calibri"/>
+          <w:sz w:val="19"/>
+        </w:rPr>
+        <w:t>• Базовая эмоция: Глубокое сочувствие, монолитное спокойствие, абсолютная уверенность</w:t>
+        <w:br/>
+      </w:r>
+      <w:r>
+        <w:rPr>
+          <w:rFonts w:ascii="Calibri" w:hAnsi="Calibri"/>
+          <w:b/>
+          <w:color w:val="1F4E5B"/>
+          <w:sz w:val="19"/>
+        </w:rPr>
+        <w:t>• Невербальное МЕТАСООБЩЕНИЕ: ««Я вижу масштаб твоей боли. Ты не сошел(ла) с ума. Я рядом, я держу штурвал. Прямо сейчас ты в безопасности, мы вытащим тебя из этого заноса».»</w:t>
+        <w:br/>
+      </w:r>
+      <w:r>
+        <w:rPr>
+          <w:rFonts w:ascii="Calibri" w:hAnsi="Calibri"/>
+          <w:sz w:val="19"/>
+        </w:rPr>
+        <w:t>• Голос, темп и тело: Темп медленный (на 20% медленнее обычного), голос низкий, грудной, бархатный. Взгляд прямой, неподвижный, теплый. Плечи расправлены, руки спокойно лежат на столе/коленях — полная телесная неподвижность, которая гипнотически заземляет зрителя.</w:t>
       </w:r>
     </w:p>
     <w:p>
@@ -299,6 +349,56 @@
     </w:p>
     <w:p>
       <w:pPr>
+        <w:spacing w:before="120" w:after="80"/>
+        <w:ind w:left="288"/>
+      </w:pPr>
+      <w:r>
+        <w:rPr>
+          <w:rFonts w:ascii="Calibri" w:hAnsi="Calibri"/>
+          <w:b/>
+          <w:color w:val="C0392B"/>
+          <w:sz w:val="20"/>
+        </w:rPr>
+        <w:t>🎬 РЕЖИССЁРСКАЯ КАРТА СПИКЕРА (КАК ВЕСТИ ЭТОТ УРОК):</w:t>
+        <w:br/>
+      </w:r>
+      <w:r>
+        <w:rPr>
+          <w:rFonts w:ascii="Calibri" w:hAnsi="Calibri"/>
+          <w:b/>
+          <w:sz w:val="19"/>
+        </w:rPr>
+        <w:t>• Роль спикера: Внимательный нейрофизиолог / Мудрый старший брат</w:t>
+        <w:br/>
+      </w:r>
+      <w:r>
+        <w:rPr>
+          <w:rFonts w:ascii="Calibri" w:hAnsi="Calibri"/>
+          <w:sz w:val="19"/>
+        </w:rPr>
+        <w:t>• Базовая эмоция: Ободряющее понимание, научная точность, легализация слабости</w:t>
+        <w:br/>
+      </w:r>
+      <w:r>
+        <w:rPr>
+          <w:rFonts w:ascii="Calibri" w:hAnsi="Calibri"/>
+          <w:b/>
+          <w:color w:val="1F4E5B"/>
+          <w:sz w:val="19"/>
+        </w:rPr>
+        <w:t>• Невербальное МЕТАСООБЩЕНИЕ: ««Твое тело реагирует правильно. Ты не сломался(лась) и не сходишь с ума. Это всего лишь химия стресса. Сейчас мы просто и технично сольем адреналин, и тебе станет легче уже через 3 минуты».»</w:t>
+        <w:br/>
+      </w:r>
+      <w:r>
+        <w:rPr>
+          <w:rFonts w:ascii="Calibri" w:hAnsi="Calibri"/>
+          <w:sz w:val="19"/>
+        </w:rPr>
+        <w:t>• Голос, темп и тело: Интонация доверительного объяснения на пальцах. Голос чуть быстрее, чем на Уроке 0, но теплый и четкий. На словах дыхания — Анатолий сам в кадре делает глубокий спокойный вдох и выдох, вовлекая зрителя в синхронное повторение.</w:t>
+      </w:r>
+    </w:p>
+    <w:p>
+      <w:pPr>
         <w:spacing w:before="160" w:after="40"/>
       </w:pPr>
       <w:r>
@@ -361,6 +461,37 @@
     </w:p>
     <w:p>
       <w:pPr>
+        <w:spacing w:before="160" w:after="40"/>
+      </w:pPr>
+      <w:r>
+        <w:rPr>
+          <w:rFonts w:ascii="Calibri" w:hAnsi="Calibri"/>
+          <w:b/>
+          <w:color w:val="0E6E5D"/>
+          <w:sz w:val="22"/>
+        </w:rPr>
+        <w:t>2. ИНТЕРАКТИВ УРОКА 1</w:t>
+      </w:r>
+    </w:p>
+    <w:p>
+      <w:pPr>
+        <w:spacing w:after="80" w:line="276" w:lineRule="auto"/>
+      </w:pPr>
+      <w:r>
+        <w:rPr>
+          <w:rFonts w:ascii="Calibri" w:hAnsi="Calibri"/>
+          <w:i w:val="0"/>
+          <w:sz w:val="20"/>
+        </w:rPr>
+        <w:t>• Экранный таймер антистресс-дыхания: Вдох (4 сек) ➔ Выдох (6 сек) ➔ Пауза (2 сек).</w:t>
+        <w:br/>
+        <w:t>• Скачиваемый материал: Памятка «4 шага к глубокому сну без снотворных при остром стрессе».</w:t>
+        <w:br/>
+        <w:t>• Кнопка: [🧭 Дрожь отпустила • Перехожу к Уроку 2]</w:t>
+      </w:r>
+    </w:p>
+    <w:p>
+      <w:pPr>
         <w:spacing w:before="240" w:after="60"/>
       </w:pPr>
       <w:r>
@@ -371,6 +502,56 @@
           <w:sz w:val="25"/>
         </w:rPr>
         <w:t>УРОК 2: ДВЕ НЕДЕЛИ ТИШИНЫ: О ЧЕМ НЕЛЬЗЯ ГОВОРИТЬ, ЧТОБЫ НЕ УНИЗИТЬСЯ И НЕ СДЕЛАТЬ ХУЖЕ</w:t>
+      </w:r>
+    </w:p>
+    <w:p>
+      <w:pPr>
+        <w:spacing w:before="120" w:after="80"/>
+        <w:ind w:left="288"/>
+      </w:pPr>
+      <w:r>
+        <w:rPr>
+          <w:rFonts w:ascii="Calibri" w:hAnsi="Calibri"/>
+          <w:b/>
+          <w:color w:val="C0392B"/>
+          <w:sz w:val="20"/>
+        </w:rPr>
+        <w:t>🎬 РЕЖИССЁРСКАЯ КАРТА СПИКЕРА (КАК ВЕСТИ ЭТОТ УРОК):</w:t>
+        <w:br/>
+      </w:r>
+      <w:r>
+        <w:rPr>
+          <w:rFonts w:ascii="Calibri" w:hAnsi="Calibri"/>
+          <w:b/>
+          <w:sz w:val="19"/>
+        </w:rPr>
+        <w:t>• Роль спикера: Строгий тактический инструктор / Наставник по безопасности</w:t>
+        <w:br/>
+      </w:r>
+      <w:r>
+        <w:rPr>
+          <w:rFonts w:ascii="Calibri" w:hAnsi="Calibri"/>
+          <w:sz w:val="19"/>
+        </w:rPr>
+        <w:t>• Базовая эмоция: Твердая бескомпромиссная забота, защита достоинства зрителя</w:t>
+        <w:br/>
+      </w:r>
+      <w:r>
+        <w:rPr>
+          <w:rFonts w:ascii="Calibri" w:hAnsi="Calibri"/>
+          <w:b/>
+          <w:color w:val="1F4E5B"/>
+          <w:sz w:val="19"/>
+        </w:rPr>
+        <w:t>• Невербальное МЕТАСООБЩЕНИЕ: ««Стоять. Ни шагу в капкан. Я запрещаю тебе унижаться и ковырять рану. Твое достоинство — это твоя главная броня. Возьми эту паузу как щит, и ты увидишь, как изменится расстановка сил».»</w:t>
+        <w:br/>
+      </w:r>
+      <w:r>
+        <w:rPr>
+          <w:rFonts w:ascii="Calibri" w:hAnsi="Calibri"/>
+          <w:sz w:val="19"/>
+        </w:rPr>
+        <w:t>• Голос, темп и тело: Четкие, чеканные фразы. Энергетика сдержанной мужской силы. Жестикуляция минимальная, но веская (ладонь «стоп» на ключевых запретах). Взгляд прямой и требовательный, внушающий дисциплину.</w:t>
       </w:r>
     </w:p>
     <w:p>
@@ -429,6 +610,37 @@
     </w:p>
     <w:p>
       <w:pPr>
+        <w:spacing w:before="160" w:after="40"/>
+      </w:pPr>
+      <w:r>
+        <w:rPr>
+          <w:rFonts w:ascii="Calibri" w:hAnsi="Calibri"/>
+          <w:b/>
+          <w:color w:val="0E6E5D"/>
+          <w:sz w:val="22"/>
+        </w:rPr>
+        <w:t>2. ИНТЕРАКТИВ УРОКА 2</w:t>
+      </w:r>
+    </w:p>
+    <w:p>
+      <w:pPr>
+        <w:spacing w:after="80" w:line="276" w:lineRule="auto"/>
+      </w:pPr>
+      <w:r>
+        <w:rPr>
+          <w:rFonts w:ascii="Calibri" w:hAnsi="Calibri"/>
+          <w:i w:val="0"/>
+          <w:sz w:val="20"/>
+        </w:rPr>
+        <w:t>• Интерактивный чек-лист: «Детектор роковых ошибок: проверяем свои действия» (3 вопроса: допросы, слежка, мольбы).</w:t>
+        <w:br/>
+        <w:t>• Скачиваемый материал: Шпаргалка «3 готовые формулировки для защиты своего достоинства в разговоре с партнером».</w:t>
+        <w:br/>
+        <w:t>• Кнопка: [🧭 Правило тишины принято • Перехожу к Уроку 3]</w:t>
+      </w:r>
+    </w:p>
+    <w:p>
+      <w:pPr>
         <w:spacing w:before="240" w:after="60"/>
       </w:pPr>
       <w:r>
@@ -439,6 +651,56 @@
           <w:sz w:val="25"/>
         </w:rPr>
         <w:t>УРОК 3: ЗАЩИТА ЛИЧНЫХ ГРАНИЦ: КАК НЕ СТАТЬ ЖЕРТВОЙ МАНИПУЛЯЦИЙ И СПЛЕТЕН</w:t>
+      </w:r>
+    </w:p>
+    <w:p>
+      <w:pPr>
+        <w:spacing w:before="120" w:after="80"/>
+        <w:ind w:left="288"/>
+      </w:pPr>
+      <w:r>
+        <w:rPr>
+          <w:rFonts w:ascii="Calibri" w:hAnsi="Calibri"/>
+          <w:b/>
+          <w:color w:val="C0392B"/>
+          <w:sz w:val="20"/>
+        </w:rPr>
+        <w:t>🎬 РЕЖИССЁРСКАЯ КАРТА СПИКЕРА (КАК ВЕСТИ ЭТОТ УРОК):</w:t>
+        <w:br/>
+      </w:r>
+      <w:r>
+        <w:rPr>
+          <w:rFonts w:ascii="Calibri" w:hAnsi="Calibri"/>
+          <w:b/>
+          <w:sz w:val="19"/>
+        </w:rPr>
+        <w:t>• Роль спикера: Стратег и защитник крепости</w:t>
+        <w:br/>
+      </w:r>
+      <w:r>
+        <w:rPr>
+          <w:rFonts w:ascii="Calibri" w:hAnsi="Calibri"/>
+          <w:sz w:val="19"/>
+        </w:rPr>
+        <w:t>• Базовая эмоция: Спокойное превосходство, отсечение лишнего шума, непоколебимость</w:t>
+        <w:br/>
+      </w:r>
+      <w:r>
+        <w:rPr>
+          <w:rFonts w:ascii="Calibri" w:hAnsi="Calibri"/>
+          <w:b/>
+          <w:color w:val="1F4E5B"/>
+          <w:sz w:val="19"/>
+        </w:rPr>
+        <w:t>• Невербальное МЕТАСООБЩЕНИЕ: ««Твоя семья и твоя душа — это суверенная территория. Закрой ворота перед зеваками и манипуляторами. Чужая вина к тебе не прилипнет, а дети будут под надежной защитой твоего спокойствия».»</w:t>
+        <w:br/>
+      </w:r>
+      <w:r>
+        <w:rPr>
+          <w:rFonts w:ascii="Calibri" w:hAnsi="Calibri"/>
+          <w:sz w:val="19"/>
+        </w:rPr>
+        <w:t>• Голос, темп и тело: Уверенный, плотный, авторитетный тон. Голос звучит как скала. Анатолий говорит без агрессии, но с абсолютной психологической высотой.</w:t>
       </w:r>
     </w:p>
     <w:p>
@@ -492,6 +754,37 @@
     </w:p>
     <w:p>
       <w:pPr>
+        <w:spacing w:before="160" w:after="40"/>
+      </w:pPr>
+      <w:r>
+        <w:rPr>
+          <w:rFonts w:ascii="Calibri" w:hAnsi="Calibri"/>
+          <w:b/>
+          <w:color w:val="0E6E5D"/>
+          <w:sz w:val="22"/>
+        </w:rPr>
+        <w:t>2. АУДИОПРАКТИКА УРОКА 3</w:t>
+      </w:r>
+    </w:p>
+    <w:p>
+      <w:pPr>
+        <w:spacing w:after="80" w:line="276" w:lineRule="auto"/>
+      </w:pPr>
+      <w:r>
+        <w:rPr>
+          <w:rFonts w:ascii="Calibri" w:hAnsi="Calibri"/>
+          <w:i w:val="0"/>
+          <w:sz w:val="20"/>
+        </w:rPr>
+        <w:t>🎧 Аудиопрактика «Эмоциональный щит: как не принимать чужую вину на себя» (10 минут).</w:t>
+        <w:br/>
+        <w:t>Гипнотическая сессия Анатолия на отделение себя от манипуляций партнера и давления окружающих.</w:t>
+        <w:br/>
+        <w:t>• Кнопка: [🧭 Границы выставлены • Перехожу к Уроку 4]</w:t>
+      </w:r>
+    </w:p>
+    <w:p>
+      <w:pPr>
         <w:spacing w:before="240" w:after="60"/>
       </w:pPr>
       <w:r>
@@ -502,6 +795,56 @@
           <w:sz w:val="25"/>
         </w:rPr>
         <w:t>УРОК 4: СМОТРИМ ПРАВДЕ В ГЛАЗА: ЕСТЬ ЛИ ШАНС ВСЁ ИСПРАВИТЬ ИЛИ ЭТО КОНЕЦ</w:t>
+      </w:r>
+    </w:p>
+    <w:p>
+      <w:pPr>
+        <w:spacing w:before="120" w:after="80"/>
+        <w:ind w:left="288"/>
+      </w:pPr>
+      <w:r>
+        <w:rPr>
+          <w:rFonts w:ascii="Calibri" w:hAnsi="Calibri"/>
+          <w:b/>
+          <w:color w:val="C0392B"/>
+          <w:sz w:val="20"/>
+        </w:rPr>
+        <w:t>🎬 РЕЖИССЁРСКАЯ КАРТА СПИКЕРА (КАК ВЕСТИ ЭТОТ УРОК):</w:t>
+        <w:br/>
+      </w:r>
+      <w:r>
+        <w:rPr>
+          <w:rFonts w:ascii="Calibri" w:hAnsi="Calibri"/>
+          <w:b/>
+          <w:sz w:val="19"/>
+        </w:rPr>
+        <w:t>• Роль спикера: Холодный независимый эксперт / Честный зеркальный диагност</w:t>
+        <w:br/>
+      </w:r>
+      <w:r>
+        <w:rPr>
+          <w:rFonts w:ascii="Calibri" w:hAnsi="Calibri"/>
+          <w:sz w:val="19"/>
+        </w:rPr>
+        <w:t>• Базовая эмоция: Трезвая ясность, доброжелательная прямота, уважение к реальности</w:t>
+        <w:br/>
+      </w:r>
+      <w:r>
+        <w:rPr>
+          <w:rFonts w:ascii="Calibri" w:hAnsi="Calibri"/>
+          <w:b/>
+          <w:color w:val="1F4E5B"/>
+          <w:sz w:val="19"/>
+        </w:rPr>
+        <w:t>• Невербальное МЕТАСООБЩЕНИЕ: ««Хватит прятаться за иллюзиями и страхом. Правда может быть горькой, но она освобождает. Давай разложим факты на стол. Ты уже достаточно силен(сильна), чтобы выдержать любую правду».»</w:t>
+        <w:br/>
+      </w:r>
+      <w:r>
+        <w:rPr>
+          <w:rFonts w:ascii="Calibri" w:hAnsi="Calibri"/>
+          <w:sz w:val="19"/>
+        </w:rPr>
+        <w:t>• Голос, темп и тело: Деловой, аналитический, структурированный тон. Никакого драматизма. Анатолий говорит размеренно, четко разделяя пункты по пальцам, создавая у зрителя ощущение ясности в голове.</w:t>
       </w:r>
     </w:p>
     <w:p>
@@ -560,6 +903,35 @@
     </w:p>
     <w:p>
       <w:pPr>
+        <w:spacing w:before="160" w:after="40"/>
+      </w:pPr>
+      <w:r>
+        <w:rPr>
+          <w:rFonts w:ascii="Calibri" w:hAnsi="Calibri"/>
+          <w:b/>
+          <w:color w:val="0E6E5D"/>
+          <w:sz w:val="22"/>
+        </w:rPr>
+        <w:t>2. ИНТЕРАКТИВ УРОКА 4</w:t>
+      </w:r>
+    </w:p>
+    <w:p>
+      <w:pPr>
+        <w:spacing w:after="80" w:line="276" w:lineRule="auto"/>
+      </w:pPr>
+      <w:r>
+        <w:rPr>
+          <w:rFonts w:ascii="Calibri" w:hAnsi="Calibri"/>
+          <w:i w:val="0"/>
+          <w:sz w:val="20"/>
+        </w:rPr>
+        <w:t>• Интерактивный опросник «Аудит реальности: Факты против Иллюзий» (5 тестовых ситуаций с автоматическим определением шанса на восстановление союза).</w:t>
+        <w:br/>
+        <w:t>• Кнопка: [🧭 Картина ясна • Перехожу к финальному Уроку 5]</w:t>
+      </w:r>
+    </w:p>
+    <w:p>
+      <w:pPr>
         <w:spacing w:before="240" w:after="60"/>
       </w:pPr>
       <w:r>
@@ -570,6 +942,56 @@
           <w:sz w:val="25"/>
         </w:rPr>
         <w:t>УРОК 5: СПАСАТЬ СЕМЬЮ ПО НОВЫМ ПРАВИЛАМ ИЛИ СПОКОЙНО УЙТИ С ВЫСОКО ПОДНЯТОЙ ГОЛОВОЙ</w:t>
+      </w:r>
+    </w:p>
+    <w:p>
+      <w:pPr>
+        <w:spacing w:before="120" w:after="80"/>
+        <w:ind w:left="288"/>
+      </w:pPr>
+      <w:r>
+        <w:rPr>
+          <w:rFonts w:ascii="Calibri" w:hAnsi="Calibri"/>
+          <w:b/>
+          <w:color w:val="C0392B"/>
+          <w:sz w:val="20"/>
+        </w:rPr>
+        <w:t>🎬 РЕЖИССЁРСКАЯ КАРТА СПИКЕРА (КАК ВЕСТИ ЭТОТ УРОК):</w:t>
+        <w:br/>
+      </w:r>
+      <w:r>
+        <w:rPr>
+          <w:rFonts w:ascii="Calibri" w:hAnsi="Calibri"/>
+          <w:b/>
+          <w:sz w:val="19"/>
+        </w:rPr>
+        <w:t>• Роль спикера: Благословляющий наставник / Архитектор новой жизни</w:t>
+        <w:br/>
+      </w:r>
+      <w:r>
+        <w:rPr>
+          <w:rFonts w:ascii="Calibri" w:hAnsi="Calibri"/>
+          <w:sz w:val="19"/>
+        </w:rPr>
+        <w:t>• Базовая эмоция: Глубокое уважение, вдохновляющая сила, передача ответственности в руки взрослого человека</w:t>
+        <w:br/>
+      </w:r>
+      <w:r>
+        <w:rPr>
+          <w:rFonts w:ascii="Calibri" w:hAnsi="Calibri"/>
+          <w:b/>
+          <w:color w:val="1F4E5B"/>
+          <w:sz w:val="19"/>
+        </w:rPr>
+        <w:t>• Невербальное МЕТАСООБЩЕНИЕ: ««Ты прошел(ла) сквозь огонь и остался(лась) человеком. Твоя опора теперь внутри тебя навсегда. Какой бы путь ты ни выбрал(а) — ты победитель, потому что ты выбрал(а) себя, свою правду и свое достоинство».»</w:t>
+        <w:br/>
+      </w:r>
+      <w:r>
+        <w:rPr>
+          <w:rFonts w:ascii="Calibri" w:hAnsi="Calibri"/>
+          <w:sz w:val="19"/>
+        </w:rPr>
+        <w:t>• Голос, темп и тело: Теплый, торжественный, глубокий и сильный голос. Легкая ободряющая полуулыбка в глазах. Энергия триумфа духа и твердости.</w:t>
       </w:r>
     </w:p>
     <w:p>
@@ -625,6 +1047,35 @@
         <w:br/>
         <w:br/>
         <w:t>Под видео вас ждет главная восстанавливающая аудиопрактика «Моя нерушимая опора» и пакет из 4 бонусов. Спокойствия вам, ясности и твердости духа. До встречи!»</w:t>
+      </w:r>
+    </w:p>
+    <w:p>
+      <w:pPr>
+        <w:spacing w:before="160" w:after="40"/>
+      </w:pPr>
+      <w:r>
+        <w:rPr>
+          <w:rFonts w:ascii="Calibri" w:hAnsi="Calibri"/>
+          <w:b/>
+          <w:color w:val="0E6E5D"/>
+          <w:sz w:val="22"/>
+        </w:rPr>
+        <w:t>2. ГЛАВНАЯ АУДИОПРАКТИКА УРОКА 5</w:t>
+      </w:r>
+    </w:p>
+    <w:p>
+      <w:pPr>
+        <w:spacing w:after="80" w:line="276" w:lineRule="auto"/>
+      </w:pPr>
+      <w:r>
+        <w:rPr>
+          <w:rFonts w:ascii="Calibri" w:hAnsi="Calibri"/>
+          <w:i w:val="0"/>
+          <w:sz w:val="20"/>
+        </w:rPr>
+        <w:t>🎧 Аудиопрактика «Моя нерушимая опора: возвращение силы и достоинства» (12 минут).</w:t>
+        <w:br/>
+        <w:t>Глубокая гипнотическая сессия на закрепление автономии, спокойной уверенности и веры в счастливое будущее.</w:t>
       </w:r>
     </w:p>
     <w:p>

</xml_diff>